<commit_message>
Update Portfolio Serzat Karaman.docx
</commit_message>
<xml_diff>
--- a/portfolio/Portfolio Serzat Karaman.docx
+++ b/portfolio/Portfolio Serzat Karaman.docx
@@ -4,7 +4,7 @@
   <w:body>
     <w:p>
       <w:pPr>
-        <w:pStyle w:val="Title"/>
+        <w:pStyle w:val="Titel"/>
         <w:tabs>
           <w:tab w:val="left" w:pos="721"/>
         </w:tabs>
@@ -390,7 +390,7 @@
       <w:sdtContent>
         <w:p>
           <w:pPr>
-            <w:pStyle w:val="TOCHeading"/>
+            <w:pStyle w:val="Kopvaninhoudsopgave"/>
           </w:pPr>
           <w:r>
             <w:t>Inhoud</w:t>
@@ -398,7 +398,7 @@
         </w:p>
         <w:p>
           <w:pPr>
-            <w:pStyle w:val="TOC2"/>
+            <w:pStyle w:val="Inhopg2"/>
             <w:tabs>
               <w:tab w:val="right" w:leader="dot" w:pos="9062"/>
             </w:tabs>
@@ -477,7 +477,7 @@
         </w:p>
         <w:p>
           <w:pPr>
-            <w:pStyle w:val="TOC1"/>
+            <w:pStyle w:val="Inhopg1"/>
             <w:tabs>
               <w:tab w:val="right" w:leader="dot" w:pos="9062"/>
             </w:tabs>
@@ -547,7 +547,7 @@
         </w:p>
         <w:p>
           <w:pPr>
-            <w:pStyle w:val="TOC2"/>
+            <w:pStyle w:val="Inhopg2"/>
             <w:tabs>
               <w:tab w:val="right" w:leader="dot" w:pos="9062"/>
             </w:tabs>
@@ -617,7 +617,7 @@
         </w:p>
         <w:p>
           <w:pPr>
-            <w:pStyle w:val="TOC2"/>
+            <w:pStyle w:val="Inhopg2"/>
             <w:tabs>
               <w:tab w:val="right" w:leader="dot" w:pos="9062"/>
             </w:tabs>
@@ -687,7 +687,7 @@
         </w:p>
         <w:p>
           <w:pPr>
-            <w:pStyle w:val="TOC2"/>
+            <w:pStyle w:val="Inhopg2"/>
             <w:tabs>
               <w:tab w:val="right" w:leader="dot" w:pos="9062"/>
             </w:tabs>
@@ -757,7 +757,7 @@
         </w:p>
         <w:p>
           <w:pPr>
-            <w:pStyle w:val="TOC2"/>
+            <w:pStyle w:val="Inhopg2"/>
             <w:tabs>
               <w:tab w:val="right" w:leader="dot" w:pos="9062"/>
             </w:tabs>
@@ -827,7 +827,7 @@
         </w:p>
         <w:p>
           <w:pPr>
-            <w:pStyle w:val="TOC2"/>
+            <w:pStyle w:val="Inhopg2"/>
             <w:tabs>
               <w:tab w:val="right" w:leader="dot" w:pos="9062"/>
             </w:tabs>
@@ -897,7 +897,7 @@
         </w:p>
         <w:p>
           <w:pPr>
-            <w:pStyle w:val="TOC2"/>
+            <w:pStyle w:val="Inhopg2"/>
             <w:tabs>
               <w:tab w:val="right" w:leader="dot" w:pos="9062"/>
             </w:tabs>
@@ -967,7 +967,7 @@
         </w:p>
         <w:p>
           <w:pPr>
-            <w:pStyle w:val="TOC2"/>
+            <w:pStyle w:val="Inhopg2"/>
             <w:tabs>
               <w:tab w:val="right" w:leader="dot" w:pos="9062"/>
             </w:tabs>
@@ -1037,7 +1037,7 @@
         </w:p>
         <w:p>
           <w:pPr>
-            <w:pStyle w:val="TOC2"/>
+            <w:pStyle w:val="Inhopg2"/>
             <w:tabs>
               <w:tab w:val="right" w:leader="dot" w:pos="9062"/>
             </w:tabs>
@@ -1107,7 +1107,7 @@
         </w:p>
         <w:p>
           <w:pPr>
-            <w:pStyle w:val="TOC2"/>
+            <w:pStyle w:val="Inhopg2"/>
             <w:tabs>
               <w:tab w:val="right" w:leader="dot" w:pos="9062"/>
             </w:tabs>
@@ -1177,7 +1177,7 @@
         </w:p>
         <w:p>
           <w:pPr>
-            <w:pStyle w:val="TOC2"/>
+            <w:pStyle w:val="Inhopg2"/>
             <w:tabs>
               <w:tab w:val="right" w:leader="dot" w:pos="9062"/>
             </w:tabs>
@@ -1247,7 +1247,7 @@
         </w:p>
         <w:p>
           <w:pPr>
-            <w:pStyle w:val="TOC2"/>
+            <w:pStyle w:val="Inhopg2"/>
             <w:tabs>
               <w:tab w:val="right" w:leader="dot" w:pos="9062"/>
             </w:tabs>
@@ -1317,7 +1317,7 @@
         </w:p>
         <w:p>
           <w:pPr>
-            <w:pStyle w:val="TOC2"/>
+            <w:pStyle w:val="Inhopg2"/>
             <w:tabs>
               <w:tab w:val="right" w:leader="dot" w:pos="9062"/>
             </w:tabs>
@@ -1387,7 +1387,7 @@
         </w:p>
         <w:p>
           <w:pPr>
-            <w:pStyle w:val="TOC2"/>
+            <w:pStyle w:val="Inhopg2"/>
             <w:tabs>
               <w:tab w:val="right" w:leader="dot" w:pos="9062"/>
             </w:tabs>
@@ -1457,7 +1457,7 @@
         </w:p>
         <w:p>
           <w:pPr>
-            <w:pStyle w:val="TOC2"/>
+            <w:pStyle w:val="Inhopg2"/>
             <w:tabs>
               <w:tab w:val="right" w:leader="dot" w:pos="9062"/>
             </w:tabs>
@@ -1527,7 +1527,7 @@
         </w:p>
         <w:p>
           <w:pPr>
-            <w:pStyle w:val="TOC1"/>
+            <w:pStyle w:val="Inhopg1"/>
             <w:tabs>
               <w:tab w:val="right" w:leader="dot" w:pos="9062"/>
             </w:tabs>
@@ -1597,7 +1597,7 @@
         </w:p>
         <w:p>
           <w:pPr>
-            <w:pStyle w:val="TOC2"/>
+            <w:pStyle w:val="Inhopg2"/>
             <w:tabs>
               <w:tab w:val="right" w:leader="dot" w:pos="9062"/>
             </w:tabs>
@@ -1667,7 +1667,7 @@
         </w:p>
         <w:p>
           <w:pPr>
-            <w:pStyle w:val="TOC2"/>
+            <w:pStyle w:val="Inhopg2"/>
             <w:tabs>
               <w:tab w:val="right" w:leader="dot" w:pos="9062"/>
             </w:tabs>
@@ -1737,7 +1737,7 @@
         </w:p>
         <w:p>
           <w:pPr>
-            <w:pStyle w:val="TOC2"/>
+            <w:pStyle w:val="Inhopg2"/>
             <w:tabs>
               <w:tab w:val="right" w:leader="dot" w:pos="9062"/>
             </w:tabs>
@@ -1807,7 +1807,7 @@
         </w:p>
         <w:p>
           <w:pPr>
-            <w:pStyle w:val="TOC2"/>
+            <w:pStyle w:val="Inhopg2"/>
             <w:tabs>
               <w:tab w:val="right" w:leader="dot" w:pos="9062"/>
             </w:tabs>
@@ -1877,7 +1877,7 @@
         </w:p>
         <w:p>
           <w:pPr>
-            <w:pStyle w:val="TOC2"/>
+            <w:pStyle w:val="Inhopg2"/>
             <w:tabs>
               <w:tab w:val="right" w:leader="dot" w:pos="9062"/>
             </w:tabs>
@@ -1947,7 +1947,7 @@
         </w:p>
         <w:p>
           <w:pPr>
-            <w:pStyle w:val="TOC2"/>
+            <w:pStyle w:val="Inhopg2"/>
             <w:tabs>
               <w:tab w:val="right" w:leader="dot" w:pos="9062"/>
             </w:tabs>
@@ -2017,7 +2017,7 @@
         </w:p>
         <w:p>
           <w:pPr>
-            <w:pStyle w:val="TOC2"/>
+            <w:pStyle w:val="Inhopg2"/>
             <w:tabs>
               <w:tab w:val="right" w:leader="dot" w:pos="9062"/>
             </w:tabs>
@@ -2087,7 +2087,7 @@
         </w:p>
         <w:p>
           <w:pPr>
-            <w:pStyle w:val="TOC2"/>
+            <w:pStyle w:val="Inhopg2"/>
             <w:tabs>
               <w:tab w:val="left" w:pos="720"/>
               <w:tab w:val="right" w:leader="dot" w:pos="9062"/>
@@ -2158,7 +2158,7 @@
         </w:p>
         <w:p>
           <w:pPr>
-            <w:pStyle w:val="TOC2"/>
+            <w:pStyle w:val="Inhopg2"/>
             <w:tabs>
               <w:tab w:val="right" w:leader="dot" w:pos="9062"/>
             </w:tabs>
@@ -2268,13 +2268,13 @@
     </w:p>
     <w:p>
       <w:pPr>
-        <w:pStyle w:val="Heading2"/>
+        <w:pStyle w:val="Kop2"/>
       </w:pPr>
       <w:bookmarkStart w:id="1" w:name="_Toc224734606"/>
     </w:p>
     <w:p>
       <w:pPr>
-        <w:pStyle w:val="Heading2"/>
+        <w:pStyle w:val="Kop2"/>
       </w:pPr>
       <w:bookmarkStart w:id="2" w:name="_Toc224738083"/>
       <w:bookmarkStart w:id="3" w:name="_Toc228830605"/>
@@ -2476,7 +2476,7 @@
     </w:p>
     <w:p>
       <w:pPr>
-        <w:pStyle w:val="Heading1"/>
+        <w:pStyle w:val="Kop1"/>
       </w:pPr>
       <w:bookmarkStart w:id="4" w:name="_Toc224738084"/>
       <w:bookmarkStart w:id="5" w:name="_Toc228830606"/>
@@ -2489,7 +2489,7 @@
     </w:p>
     <w:p>
       <w:pPr>
-        <w:pStyle w:val="Heading2"/>
+        <w:pStyle w:val="Kop2"/>
       </w:pPr>
       <w:bookmarkStart w:id="6" w:name="_Toc224738085"/>
       <w:bookmarkStart w:id="7" w:name="_Toc228830607"/>
@@ -3088,7 +3088,7 @@
     </w:p>
     <w:p>
       <w:pPr>
-        <w:pStyle w:val="Heading2"/>
+        <w:pStyle w:val="Kop2"/>
       </w:pPr>
       <w:bookmarkStart w:id="8" w:name="_Toc224738086"/>
       <w:bookmarkStart w:id="9" w:name="_Toc228830608"/>
@@ -3484,7 +3484,7 @@
     </w:p>
     <w:p>
       <w:pPr>
-        <w:pStyle w:val="Heading2"/>
+        <w:pStyle w:val="Kop2"/>
       </w:pPr>
       <w:bookmarkStart w:id="10" w:name="_Toc224738087"/>
       <w:bookmarkStart w:id="11" w:name="_Toc228830609"/>
@@ -3534,7 +3534,7 @@
     </w:p>
     <w:p>
       <w:pPr>
-        <w:pStyle w:val="Heading2"/>
+        <w:pStyle w:val="Kop2"/>
       </w:pPr>
       <w:bookmarkStart w:id="12" w:name="_Toc224738088"/>
       <w:bookmarkStart w:id="13" w:name="_Toc228830610"/>
@@ -3621,7 +3621,7 @@
     </w:p>
     <w:p>
       <w:pPr>
-        <w:pStyle w:val="Heading2"/>
+        <w:pStyle w:val="Kop2"/>
       </w:pPr>
       <w:bookmarkStart w:id="14" w:name="_Toc224738089"/>
       <w:bookmarkStart w:id="15" w:name="_Toc228830611"/>
@@ -3688,7 +3688,7 @@
             </w:pPr>
             <w:r>
               <w:rPr>
-                <w:rStyle w:val="Strong"/>
+                <w:rStyle w:val="Zwaar"/>
                 <w:rFonts w:ascii="Arial" w:hAnsi="Arial" w:cs="Arial"/>
               </w:rPr>
               <w:t>Stap</w:t>
@@ -3715,7 +3715,7 @@
             </w:pPr>
             <w:r>
               <w:rPr>
-                <w:rStyle w:val="Strong"/>
+                <w:rStyle w:val="Zwaar"/>
                 <w:rFonts w:ascii="Arial" w:hAnsi="Arial" w:cs="Arial"/>
               </w:rPr>
               <w:t>Uitwerking in de praktijk</w:t>
@@ -4035,7 +4035,7 @@
             </w:pPr>
             <w:r>
               <w:rPr>
-                <w:rStyle w:val="Strong"/>
+                <w:rStyle w:val="Zwaar"/>
                 <w:rFonts w:ascii="Arial" w:hAnsi="Arial" w:cs="Arial"/>
               </w:rPr>
               <w:lastRenderedPageBreak/>
@@ -4062,7 +4062,7 @@
             </w:pPr>
             <w:r>
               <w:rPr>
-                <w:rStyle w:val="Strong"/>
+                <w:rStyle w:val="Zwaar"/>
                 <w:rFonts w:ascii="Arial" w:hAnsi="Arial" w:cs="Arial"/>
               </w:rPr>
               <w:t>Uitwerking in de praktijk</w:t>
@@ -4314,7 +4314,7 @@
     </w:p>
     <w:p>
       <w:pPr>
-        <w:pStyle w:val="Heading2"/>
+        <w:pStyle w:val="Kop2"/>
       </w:pPr>
       <w:bookmarkStart w:id="16" w:name="_Toc224738090"/>
       <w:bookmarkStart w:id="17" w:name="_Toc228830612"/>
@@ -4386,7 +4386,7 @@
     </w:p>
     <w:p>
       <w:pPr>
-        <w:pStyle w:val="Heading2"/>
+        <w:pStyle w:val="Kop2"/>
       </w:pPr>
       <w:bookmarkStart w:id="18" w:name="_Toc224738091"/>
       <w:bookmarkStart w:id="19" w:name="_Toc228830613"/>
@@ -4434,7 +4434,7 @@
     </w:p>
     <w:p>
       <w:pPr>
-        <w:pStyle w:val="Heading2"/>
+        <w:pStyle w:val="Kop2"/>
       </w:pPr>
       <w:bookmarkStart w:id="20" w:name="_Toc224738092"/>
       <w:bookmarkStart w:id="21" w:name="_Toc228830614"/>
@@ -4533,7 +4533,7 @@
             </w:pPr>
             <w:r>
               <w:rPr>
-                <w:rStyle w:val="Strong"/>
+                <w:rStyle w:val="Zwaar"/>
                 <w:rFonts w:ascii="Arial" w:hAnsi="Arial" w:cs="Arial"/>
               </w:rPr>
               <w:t>Stap</w:t>
@@ -4560,7 +4560,7 @@
             </w:pPr>
             <w:r>
               <w:rPr>
-                <w:rStyle w:val="Strong"/>
+                <w:rStyle w:val="Zwaar"/>
                 <w:rFonts w:ascii="Arial" w:hAnsi="Arial" w:cs="Arial"/>
               </w:rPr>
               <w:t>Uitwerking</w:t>
@@ -5027,7 +5027,7 @@
             </w:pPr>
             <w:r>
               <w:rPr>
-                <w:rStyle w:val="Strong"/>
+                <w:rStyle w:val="Zwaar"/>
                 <w:rFonts w:ascii="Arial" w:hAnsi="Arial" w:cs="Arial"/>
               </w:rPr>
               <w:t>Stap</w:t>
@@ -5054,7 +5054,7 @@
             </w:pPr>
             <w:r>
               <w:rPr>
-                <w:rStyle w:val="Strong"/>
+                <w:rStyle w:val="Zwaar"/>
                 <w:rFonts w:ascii="Arial" w:hAnsi="Arial" w:cs="Arial"/>
               </w:rPr>
               <w:t>Uitwerking</w:t>
@@ -5365,7 +5365,7 @@
     </w:p>
     <w:p>
       <w:pPr>
-        <w:pStyle w:val="Heading2"/>
+        <w:pStyle w:val="Kop2"/>
       </w:pPr>
       <w:bookmarkStart w:id="22" w:name="_Toc224738093"/>
       <w:bookmarkStart w:id="23" w:name="_Toc228830615"/>
@@ -5419,7 +5419,7 @@
             </w:pPr>
             <w:r>
               <w:rPr>
-                <w:rStyle w:val="Strong"/>
+                <w:rStyle w:val="Zwaar"/>
                 <w:rFonts w:ascii="Arial" w:hAnsi="Arial" w:cs="Arial"/>
               </w:rPr>
               <w:t>Stap</w:t>
@@ -5446,7 +5446,7 @@
             </w:pPr>
             <w:r>
               <w:rPr>
-                <w:rStyle w:val="Strong"/>
+                <w:rStyle w:val="Zwaar"/>
                 <w:rFonts w:ascii="Arial" w:hAnsi="Arial" w:cs="Arial"/>
               </w:rPr>
               <w:t>Uitwerking: Plannen &amp; Taakinitiatie</w:t>
@@ -5771,7 +5771,7 @@
     </w:p>
     <w:p>
       <w:pPr>
-        <w:pStyle w:val="Heading2"/>
+        <w:pStyle w:val="Kop2"/>
       </w:pPr>
       <w:bookmarkStart w:id="24" w:name="_Toc224738094"/>
       <w:bookmarkStart w:id="25" w:name="_Toc228830616"/>
@@ -5835,7 +5835,7 @@
     </w:p>
     <w:p>
       <w:pPr>
-        <w:pStyle w:val="Heading2"/>
+        <w:pStyle w:val="Kop2"/>
       </w:pPr>
       <w:bookmarkStart w:id="26" w:name="_Toc224738095"/>
       <w:bookmarkStart w:id="27" w:name="_Toc228830617"/>
@@ -5876,12 +5876,12 @@
     </w:p>
     <w:p>
       <w:pPr>
-        <w:pStyle w:val="Heading2"/>
-      </w:pPr>
-    </w:p>
-    <w:p>
-      <w:pPr>
-        <w:pStyle w:val="Heading2"/>
+        <w:pStyle w:val="Kop2"/>
+      </w:pPr>
+    </w:p>
+    <w:p>
+      <w:pPr>
+        <w:pStyle w:val="Kop2"/>
       </w:pPr>
       <w:bookmarkStart w:id="28" w:name="_Toc224738096"/>
       <w:bookmarkStart w:id="29" w:name="_Toc228830618"/>
@@ -6122,13 +6122,13 @@
     </w:p>
     <w:p>
       <w:pPr>
-        <w:pStyle w:val="Heading2"/>
+        <w:pStyle w:val="Kop2"/>
       </w:pPr>
       <w:bookmarkStart w:id="30" w:name="_Toc224738097"/>
     </w:p>
     <w:p>
       <w:pPr>
-        <w:pStyle w:val="Heading2"/>
+        <w:pStyle w:val="Kop2"/>
       </w:pPr>
     </w:p>
     <w:p/>
@@ -6144,7 +6144,7 @@
     <w:p/>
     <w:p>
       <w:pPr>
-        <w:pStyle w:val="Heading2"/>
+        <w:pStyle w:val="Kop2"/>
       </w:pPr>
       <w:bookmarkStart w:id="31" w:name="_Toc228830619"/>
       <w:r>
@@ -6533,7 +6533,7 @@
     </w:p>
     <w:p>
       <w:pPr>
-        <w:pStyle w:val="Heading2"/>
+        <w:pStyle w:val="Kop2"/>
       </w:pPr>
       <w:bookmarkStart w:id="32" w:name="_Toc224738098"/>
       <w:bookmarkStart w:id="33" w:name="_Toc228830620"/>
@@ -6578,7 +6578,7 @@
     </w:p>
     <w:p>
       <w:pPr>
-        <w:pStyle w:val="Heading1"/>
+        <w:pStyle w:val="Kop1"/>
       </w:pPr>
       <w:bookmarkStart w:id="34" w:name="_Toc224738099"/>
       <w:bookmarkStart w:id="35" w:name="_Toc228830621"/>
@@ -6591,7 +6591,7 @@
     </w:p>
     <w:p>
       <w:pPr>
-        <w:pStyle w:val="Heading2"/>
+        <w:pStyle w:val="Kop2"/>
       </w:pPr>
       <w:bookmarkStart w:id="36" w:name="_Toc224738100"/>
       <w:bookmarkStart w:id="37" w:name="_Toc228830622"/>
@@ -7556,7 +7556,7 @@
     </w:p>
     <w:p>
       <w:pPr>
-        <w:pStyle w:val="Heading2"/>
+        <w:pStyle w:val="Kop2"/>
       </w:pPr>
       <w:bookmarkStart w:id="38" w:name="_Toc228830623"/>
       <w:r>
@@ -7669,7 +7669,7 @@
     </w:p>
     <w:p>
       <w:pPr>
-        <w:pStyle w:val="ListParagraph"/>
+        <w:pStyle w:val="Lijstalinea"/>
         <w:spacing w:before="100" w:beforeAutospacing="1" w:after="100" w:afterAutospacing="1" w:line="240" w:lineRule="auto"/>
         <w:rPr>
           <w:rFonts w:ascii="Times New Roman" w:eastAsia="Times New Roman" w:hAnsi="Times New Roman" w:cs="Times New Roman"/>
@@ -7710,7 +7710,7 @@
     </w:p>
     <w:p>
       <w:pPr>
-        <w:pStyle w:val="ListParagraph"/>
+        <w:pStyle w:val="Lijstalinea"/>
         <w:spacing w:before="100" w:beforeAutospacing="1" w:after="100" w:afterAutospacing="1" w:line="240" w:lineRule="auto"/>
         <w:rPr>
           <w:rFonts w:ascii="Times New Roman" w:eastAsia="Times New Roman" w:hAnsi="Times New Roman" w:cs="Times New Roman"/>
@@ -7751,7 +7751,7 @@
     </w:p>
     <w:p>
       <w:pPr>
-        <w:pStyle w:val="ListParagraph"/>
+        <w:pStyle w:val="Lijstalinea"/>
         <w:spacing w:before="100" w:beforeAutospacing="1" w:after="100" w:afterAutospacing="1" w:line="240" w:lineRule="auto"/>
         <w:rPr>
           <w:rFonts w:ascii="Times New Roman" w:eastAsia="Times New Roman" w:hAnsi="Times New Roman" w:cs="Times New Roman"/>
@@ -8550,7 +8550,7 @@
       </w:r>
       <w:r>
         <w:rPr>
-          <w:rStyle w:val="Heading2Char"/>
+          <w:rStyle w:val="Kop2Char"/>
         </w:rPr>
         <w:t>Voorbereidende opdrachten</w:t>
       </w:r>
@@ -8806,7 +8806,7 @@
     </w:p>
     <w:p>
       <w:pPr>
-        <w:pStyle w:val="Heading2"/>
+        <w:pStyle w:val="Kop2"/>
       </w:pPr>
       <w:bookmarkStart w:id="39" w:name="_Toc228830624"/>
       <w:r>
@@ -8913,48 +8913,48 @@
     </w:p>
     <w:p>
       <w:pPr>
-        <w:pStyle w:val="Heading2"/>
-      </w:pPr>
-    </w:p>
-    <w:p>
-      <w:pPr>
-        <w:pStyle w:val="Heading2"/>
-      </w:pPr>
-    </w:p>
-    <w:p>
-      <w:pPr>
-        <w:pStyle w:val="Heading2"/>
-      </w:pPr>
-    </w:p>
-    <w:p>
-      <w:pPr>
-        <w:pStyle w:val="Heading2"/>
+        <w:pStyle w:val="Kop2"/>
+      </w:pPr>
+    </w:p>
+    <w:p>
+      <w:pPr>
+        <w:pStyle w:val="Kop2"/>
+      </w:pPr>
+    </w:p>
+    <w:p>
+      <w:pPr>
+        <w:pStyle w:val="Kop2"/>
+      </w:pPr>
+    </w:p>
+    <w:p>
+      <w:pPr>
+        <w:pStyle w:val="Kop2"/>
       </w:pPr>
     </w:p>
     <w:p/>
     <w:p>
       <w:pPr>
-        <w:pStyle w:val="Heading2"/>
-      </w:pPr>
-    </w:p>
-    <w:p>
-      <w:pPr>
-        <w:pStyle w:val="Heading2"/>
-      </w:pPr>
-    </w:p>
-    <w:p>
-      <w:pPr>
-        <w:pStyle w:val="Heading2"/>
-      </w:pPr>
-    </w:p>
-    <w:p>
-      <w:pPr>
-        <w:pStyle w:val="Heading2"/>
-      </w:pPr>
-    </w:p>
-    <w:p>
-      <w:pPr>
-        <w:pStyle w:val="Heading2"/>
+        <w:pStyle w:val="Kop2"/>
+      </w:pPr>
+    </w:p>
+    <w:p>
+      <w:pPr>
+        <w:pStyle w:val="Kop2"/>
+      </w:pPr>
+    </w:p>
+    <w:p>
+      <w:pPr>
+        <w:pStyle w:val="Kop2"/>
+      </w:pPr>
+    </w:p>
+    <w:p>
+      <w:pPr>
+        <w:pStyle w:val="Kop2"/>
+      </w:pPr>
+    </w:p>
+    <w:p>
+      <w:pPr>
+        <w:pStyle w:val="Kop2"/>
       </w:pPr>
       <w:bookmarkStart w:id="40" w:name="_Toc228830625"/>
       <w:r>
@@ -9345,7 +9345,7 @@
       </w:r>
       <w:r>
         <w:rPr>
-          <w:rStyle w:val="Heading2Char"/>
+          <w:rStyle w:val="Kop2Char"/>
         </w:rPr>
         <w:t>Bedrijfsonderzoek:</w:t>
       </w:r>
@@ -9578,7 +9578,7 @@
       </w:r>
       <w:r>
         <w:rPr>
-          <w:rStyle w:val="Heading2Char"/>
+          <w:rStyle w:val="Kop2Char"/>
         </w:rPr>
         <w:t>Aantekeningen uit de les</w:t>
       </w:r>
@@ -9664,139 +9664,170 @@
     </w:p>
     <w:p>
       <w:pPr>
-        <w:rPr>
-          <w:rFonts w:ascii="Arial" w:hAnsi="Arial" w:cs="Arial"/>
-        </w:rPr>
-      </w:pPr>
-      <w:r>
+        <w:pStyle w:val="Normaalweb"/>
         <w:rPr>
           <w:rFonts w:ascii="Arial" w:hAnsi="Arial" w:cs="Arial"/>
           <w:b/>
           <w:bCs/>
         </w:rPr>
-        <w:t>B. Oefenen met De 6 Denkhoeden van De Bono &amp; Netwerken</w:t>
-      </w:r>
-      <w:r>
-        <w:rPr>
-          <w:rFonts w:ascii="Arial" w:hAnsi="Arial" w:cs="Arial"/>
-        </w:rPr>
-        <w:t xml:space="preserve"> Tijdens de les hebben we gekeken naar netwerken via de 6 denkhoeden van De Bono. Dit heeft mij het volgende geleerd over netwerken:</w:t>
-      </w:r>
-    </w:p>
-    <w:p>
-      <w:pPr>
+      </w:pPr>
+      <w:r>
+        <w:rPr>
+          <w:rFonts w:ascii="Arial" w:hAnsi="Arial" w:cs="Arial"/>
+          <w:b/>
+          <w:bCs/>
+        </w:rPr>
+        <w:t xml:space="preserve">B. Oefenen met De 6 Denkhoeden van De </w:t>
+      </w:r>
+      <w:proofErr w:type="spellStart"/>
+      <w:r>
+        <w:rPr>
+          <w:rFonts w:ascii="Arial" w:hAnsi="Arial" w:cs="Arial"/>
+          <w:b/>
+          <w:bCs/>
+        </w:rPr>
+        <w:t>Bono</w:t>
+      </w:r>
+      <w:proofErr w:type="spellEnd"/>
+      <w:r>
+        <w:rPr>
+          <w:rFonts w:ascii="Arial" w:hAnsi="Arial" w:cs="Arial"/>
+          <w:b/>
+          <w:bCs/>
+        </w:rPr>
+        <w:t xml:space="preserve"> (Netwerken, Brief &amp; CV)</w:t>
+      </w:r>
+    </w:p>
+    <w:p>
+      <w:pPr>
+        <w:pStyle w:val="Normaalweb"/>
+        <w:rPr>
+          <w:rFonts w:ascii="Arial" w:hAnsi="Arial" w:cs="Arial"/>
+        </w:rPr>
+      </w:pPr>
+      <w:r>
+        <w:rPr>
+          <w:rFonts w:ascii="Arial" w:hAnsi="Arial" w:cs="Arial"/>
+        </w:rPr>
+        <w:t xml:space="preserve">Tijdens de les en tijdens het herzien van mijn documenten heb ik de 6 denkhoeden van De </w:t>
+      </w:r>
+      <w:proofErr w:type="spellStart"/>
+      <w:r>
+        <w:rPr>
+          <w:rFonts w:ascii="Arial" w:hAnsi="Arial" w:cs="Arial"/>
+        </w:rPr>
+        <w:t>Bono</w:t>
+      </w:r>
+      <w:proofErr w:type="spellEnd"/>
+      <w:r>
+        <w:rPr>
+          <w:rFonts w:ascii="Arial" w:hAnsi="Arial" w:cs="Arial"/>
+        </w:rPr>
+        <w:t xml:space="preserve"> meerdere keren toegepast om echt concrete verbeteringen door te voeren in mijn netwerkaanpak, mijn sollicitatiebrief en mijn CV.</w:t>
+      </w:r>
+    </w:p>
+    <w:p>
+      <w:pPr>
+        <w:pStyle w:val="Normaalweb"/>
+        <w:rPr>
+          <w:rFonts w:ascii="Arial" w:hAnsi="Arial" w:cs="Arial"/>
+          <w:b/>
+          <w:bCs/>
+        </w:rPr>
+      </w:pPr>
+      <w:r>
+        <w:rPr>
+          <w:rFonts w:ascii="Arial" w:hAnsi="Arial" w:cs="Arial"/>
+          <w:b/>
+          <w:bCs/>
+        </w:rPr>
+        <w:t>1. Toepassing op Netwerken:</w:t>
+      </w:r>
+    </w:p>
+    <w:p>
+      <w:pPr>
+        <w:pStyle w:val="Normaalweb"/>
         <w:numPr>
           <w:ilvl w:val="0"/>
-          <w:numId w:val="16"/>
+          <w:numId w:val="28"/>
         </w:numPr>
-        <w:rPr>
-          <w:rFonts w:ascii="Arial" w:hAnsi="Arial" w:cs="Arial"/>
-        </w:rPr>
-      </w:pPr>
-      <w:r>
-        <w:rPr>
-          <w:rFonts w:ascii="Arial" w:hAnsi="Arial" w:cs="Arial"/>
-        </w:rPr>
-        <w:t xml:space="preserve">Normaal gesproken bekijk ik netwerken vaak vanuit de </w:t>
-      </w:r>
-      <w:r>
         <w:rPr>
           <w:rFonts w:ascii="Arial" w:hAnsi="Arial" w:cs="Arial"/>
           <w:b/>
           <w:bCs/>
         </w:rPr>
-        <w:t>Rode hoed (gevoel)</w:t>
-      </w:r>
-      <w:r>
-        <w:rPr>
-          <w:rFonts w:ascii="Arial" w:hAnsi="Arial" w:cs="Arial"/>
-        </w:rPr>
-        <w:t xml:space="preserve"> : ik vind het best spannend en ongemakkelijk om op onbekende mensen af te stappen. Soms denk ik te veel vanuit de </w:t>
-      </w:r>
+      </w:pPr>
       <w:r>
         <w:rPr>
           <w:rFonts w:ascii="Arial" w:hAnsi="Arial" w:cs="Arial"/>
           <w:b/>
           <w:bCs/>
         </w:rPr>
-        <w:t>Zwarte hoed (risico's)</w:t>
-      </w:r>
-      <w:r>
-        <w:rPr>
-          <w:rFonts w:ascii="Arial" w:hAnsi="Arial" w:cs="Arial"/>
-        </w:rPr>
-        <w:t xml:space="preserve"> en ben ik bang dat ik opdringerig overkom.</w:t>
-      </w:r>
-    </w:p>
-    <w:p>
-      <w:pPr>
+        <w:t xml:space="preserve">Rode hoed (Gevoel): </w:t>
+      </w:r>
+      <w:r>
+        <w:rPr>
+          <w:rFonts w:ascii="Arial" w:hAnsi="Arial" w:cs="Arial"/>
+        </w:rPr>
+        <w:t>Normaal gesproken bekijk ik netwerken vanuit mijn gevoel; ik vind het best spannend en ongemakkelijk om op onbekende mensen af te stappen.</w:t>
+      </w:r>
+      <w:r>
+        <w:rPr>
+          <w:rFonts w:ascii="Arial" w:hAnsi="Arial" w:cs="Arial"/>
+          <w:b/>
+          <w:bCs/>
+        </w:rPr>
+        <w:t xml:space="preserve"> </w:t>
+      </w:r>
+    </w:p>
+    <w:p>
+      <w:pPr>
+        <w:pStyle w:val="Normaalweb"/>
         <w:numPr>
           <w:ilvl w:val="0"/>
-          <w:numId w:val="16"/>
+          <w:numId w:val="28"/>
         </w:numPr>
-        <w:rPr>
-          <w:rFonts w:ascii="Arial" w:hAnsi="Arial" w:cs="Arial"/>
-        </w:rPr>
-      </w:pPr>
-      <w:r>
-        <w:rPr>
-          <w:rFonts w:ascii="Arial" w:hAnsi="Arial" w:cs="Arial"/>
-        </w:rPr>
-        <w:t xml:space="preserve">Door de </w:t>
-      </w:r>
-      <w:r>
         <w:rPr>
           <w:rFonts w:ascii="Arial" w:hAnsi="Arial" w:cs="Arial"/>
           <w:b/>
           <w:bCs/>
         </w:rPr>
-        <w:t>Gele hoed (kansen)</w:t>
-      </w:r>
-      <w:r>
-        <w:rPr>
-          <w:rFonts w:ascii="Arial" w:hAnsi="Arial" w:cs="Arial"/>
-        </w:rPr>
-        <w:t xml:space="preserve"> op te zetten , realiseerde ik me wat het me kan opleveren: sneller een stageplek vinden en leren van mensen uit het werkveld.</w:t>
-      </w:r>
-    </w:p>
-    <w:p>
-      <w:pPr>
+      </w:pPr>
+      <w:r>
+        <w:rPr>
+          <w:rFonts w:ascii="Arial" w:hAnsi="Arial" w:cs="Arial"/>
+          <w:b/>
+          <w:bCs/>
+        </w:rPr>
+        <w:t xml:space="preserve">Zwarte hoed (Risico's): </w:t>
+      </w:r>
+      <w:r>
+        <w:rPr>
+          <w:rFonts w:ascii="Arial" w:hAnsi="Arial" w:cs="Arial"/>
+        </w:rPr>
+        <w:t>Soms denk ik te veel na over de risico's en ben ik bang dat ik opdringerig overkom bij bedrijven.</w:t>
+      </w:r>
+      <w:r>
+        <w:rPr>
+          <w:rFonts w:ascii="Arial" w:hAnsi="Arial" w:cs="Arial"/>
+          <w:b/>
+          <w:bCs/>
+        </w:rPr>
+        <w:t xml:space="preserve"> </w:t>
+      </w:r>
+    </w:p>
+    <w:p>
+      <w:pPr>
+        <w:pStyle w:val="Normaalweb"/>
         <w:numPr>
           <w:ilvl w:val="0"/>
-          <w:numId w:val="16"/>
+          <w:numId w:val="28"/>
         </w:numPr>
-        <w:rPr>
-          <w:rFonts w:ascii="Arial" w:hAnsi="Arial" w:cs="Arial"/>
-        </w:rPr>
-      </w:pPr>
-      <w:r>
-        <w:rPr>
-          <w:rFonts w:ascii="Arial" w:hAnsi="Arial" w:cs="Arial"/>
-        </w:rPr>
-        <w:t xml:space="preserve">Met de </w:t>
-      </w:r>
-      <w:r>
         <w:rPr>
           <w:rFonts w:ascii="Arial" w:hAnsi="Arial" w:cs="Arial"/>
           <w:b/>
           <w:bCs/>
         </w:rPr>
-        <w:t>Groene hoed (creativiteit)</w:t>
-      </w:r>
-      <w:r>
-        <w:rPr>
-          <w:rFonts w:ascii="Arial" w:hAnsi="Arial" w:cs="Arial"/>
-        </w:rPr>
-        <w:t xml:space="preserve"> heb ik bedacht dat netwerken niet per se op grote, drukke evenementen hoeft. Ik kan het ook op mijn eigen manier aanpakken , bijvoorbeeld via 1-op-1 gesprekken online (via LinkedIn) of door kleine meetups te bezoeken. Dit past veel beter bij mij.</w:t>
-      </w:r>
-    </w:p>
-    <w:p>
-      <w:pPr>
-        <w:pStyle w:val="NormalWeb"/>
-        <w:spacing w:before="0" w:beforeAutospacing="0"/>
-        <w:rPr>
-          <w:rFonts w:ascii="Arial" w:hAnsi="Arial" w:cs="Arial"/>
-        </w:rPr>
       </w:pPr>
       <w:r>
         <w:rPr>
@@ -9804,6 +9835,322 @@
           <w:b/>
           <w:bCs/>
         </w:rPr>
+        <w:t xml:space="preserve">Gele hoed (Kansen): </w:t>
+      </w:r>
+      <w:r>
+        <w:rPr>
+          <w:rFonts w:ascii="Arial" w:hAnsi="Arial" w:cs="Arial"/>
+        </w:rPr>
+        <w:t xml:space="preserve">Door de gele hoed op te zetten, realiseerde ik me wat het me kan opleveren: sneller een geschikte stageplek vinden en waardevolle kennis opdoen van mensen uit het werkveld. </w:t>
+      </w:r>
+    </w:p>
+    <w:p>
+      <w:pPr>
+        <w:pStyle w:val="Normaalweb"/>
+        <w:numPr>
+          <w:ilvl w:val="0"/>
+          <w:numId w:val="28"/>
+        </w:numPr>
+        <w:rPr>
+          <w:rFonts w:ascii="Arial" w:hAnsi="Arial" w:cs="Arial"/>
+        </w:rPr>
+      </w:pPr>
+      <w:r>
+        <w:rPr>
+          <w:rFonts w:ascii="Arial" w:hAnsi="Arial" w:cs="Arial"/>
+          <w:b/>
+          <w:bCs/>
+        </w:rPr>
+        <w:t xml:space="preserve">Groene hoed (Creativiteit): </w:t>
+      </w:r>
+      <w:r>
+        <w:rPr>
+          <w:rFonts w:ascii="Arial" w:hAnsi="Arial" w:cs="Arial"/>
+        </w:rPr>
+        <w:t xml:space="preserve">Hiermee heb ik bedacht dat netwerken niet per se op grote, drukke evenementen hoeft. Ik kan creatief netwerken via 1-op-1 gesprekken online (via LinkedIn) of door kleine, lokale </w:t>
+      </w:r>
+      <w:proofErr w:type="spellStart"/>
+      <w:r>
+        <w:rPr>
+          <w:rFonts w:ascii="Arial" w:hAnsi="Arial" w:cs="Arial"/>
+        </w:rPr>
+        <w:t>meetups</w:t>
+      </w:r>
+      <w:proofErr w:type="spellEnd"/>
+      <w:r>
+        <w:rPr>
+          <w:rFonts w:ascii="Arial" w:hAnsi="Arial" w:cs="Arial"/>
+        </w:rPr>
+        <w:t xml:space="preserve"> te bezoeken. Dit past veel beter bij mijn persoonlijke stijl. </w:t>
+      </w:r>
+    </w:p>
+    <w:p>
+      <w:pPr>
+        <w:pStyle w:val="Normaalweb"/>
+        <w:rPr>
+          <w:rFonts w:ascii="Arial" w:hAnsi="Arial" w:cs="Arial"/>
+          <w:b/>
+          <w:bCs/>
+        </w:rPr>
+      </w:pPr>
+    </w:p>
+    <w:p>
+      <w:pPr>
+        <w:pStyle w:val="Normaalweb"/>
+        <w:rPr>
+          <w:rFonts w:ascii="Arial" w:hAnsi="Arial" w:cs="Arial"/>
+          <w:b/>
+          <w:bCs/>
+        </w:rPr>
+      </w:pPr>
+    </w:p>
+    <w:p>
+      <w:pPr>
+        <w:pStyle w:val="Normaalweb"/>
+        <w:rPr>
+          <w:rFonts w:ascii="Arial" w:hAnsi="Arial" w:cs="Arial"/>
+          <w:b/>
+          <w:bCs/>
+        </w:rPr>
+      </w:pPr>
+      <w:r>
+        <w:rPr>
+          <w:rFonts w:ascii="Arial" w:hAnsi="Arial" w:cs="Arial"/>
+          <w:b/>
+          <w:bCs/>
+        </w:rPr>
+        <w:lastRenderedPageBreak/>
+        <w:t>2. Toepassing op mijn Sollicitatiebrief:</w:t>
+      </w:r>
+    </w:p>
+    <w:p>
+      <w:pPr>
+        <w:pStyle w:val="Normaalweb"/>
+        <w:numPr>
+          <w:ilvl w:val="0"/>
+          <w:numId w:val="29"/>
+        </w:numPr>
+        <w:rPr>
+          <w:rFonts w:ascii="Arial" w:hAnsi="Arial" w:cs="Arial"/>
+          <w:b/>
+          <w:bCs/>
+        </w:rPr>
+      </w:pPr>
+      <w:r>
+        <w:rPr>
+          <w:rFonts w:ascii="Arial" w:hAnsi="Arial" w:cs="Arial"/>
+          <w:b/>
+          <w:bCs/>
+        </w:rPr>
+        <w:t xml:space="preserve">Zwarte hoed (Kritisch/Risico's): </w:t>
+      </w:r>
+      <w:r>
+        <w:rPr>
+          <w:rFonts w:ascii="Arial" w:hAnsi="Arial" w:cs="Arial"/>
+        </w:rPr>
+        <w:t>Bij het kritisch analyseren van mijn eerste brief merkte ik dat mijn zinnen soms te lang waren (meer dan 25 woorden) en te passief geschreven. Ook lag de focus te veel op een algemene opsomming in plaats van mijn persoonlijke motivatie voor Eye-C.</w:t>
+      </w:r>
+      <w:r>
+        <w:rPr>
+          <w:rFonts w:ascii="Arial" w:hAnsi="Arial" w:cs="Arial"/>
+          <w:b/>
+          <w:bCs/>
+        </w:rPr>
+        <w:t xml:space="preserve"> </w:t>
+      </w:r>
+    </w:p>
+    <w:p>
+      <w:pPr>
+        <w:pStyle w:val="Normaalweb"/>
+        <w:numPr>
+          <w:ilvl w:val="0"/>
+          <w:numId w:val="29"/>
+        </w:numPr>
+        <w:rPr>
+          <w:rFonts w:ascii="Arial" w:hAnsi="Arial" w:cs="Arial"/>
+        </w:rPr>
+      </w:pPr>
+      <w:r>
+        <w:rPr>
+          <w:rFonts w:ascii="Arial" w:hAnsi="Arial" w:cs="Arial"/>
+          <w:b/>
+          <w:bCs/>
+        </w:rPr>
+        <w:t xml:space="preserve">Gele hoed (Voordelen): </w:t>
+      </w:r>
+      <w:r>
+        <w:rPr>
+          <w:rFonts w:ascii="Arial" w:hAnsi="Arial" w:cs="Arial"/>
+        </w:rPr>
+        <w:t xml:space="preserve">Het opsplitsen van de lange zinnen en het actiever maken van de tekst zorgt ervoor dat de brief direct veel krachtiger overkomt op een </w:t>
+      </w:r>
+      <w:proofErr w:type="spellStart"/>
+      <w:r>
+        <w:rPr>
+          <w:rFonts w:ascii="Arial" w:hAnsi="Arial" w:cs="Arial"/>
+        </w:rPr>
+        <w:t>recruiter</w:t>
+      </w:r>
+      <w:proofErr w:type="spellEnd"/>
+      <w:r>
+        <w:rPr>
+          <w:rFonts w:ascii="Arial" w:hAnsi="Arial" w:cs="Arial"/>
+        </w:rPr>
+        <w:t>. Daarnaast past de brief nu perfect op exact één A4-tje.</w:t>
+      </w:r>
+    </w:p>
+    <w:p>
+      <w:pPr>
+        <w:pStyle w:val="Normaalweb"/>
+        <w:numPr>
+          <w:ilvl w:val="0"/>
+          <w:numId w:val="29"/>
+        </w:numPr>
+        <w:rPr>
+          <w:rFonts w:ascii="Arial" w:hAnsi="Arial" w:cs="Arial"/>
+          <w:b/>
+          <w:bCs/>
+        </w:rPr>
+      </w:pPr>
+      <w:r>
+        <w:rPr>
+          <w:rFonts w:ascii="Arial" w:hAnsi="Arial" w:cs="Arial"/>
+          <w:b/>
+          <w:bCs/>
+        </w:rPr>
+        <w:t xml:space="preserve">Groene hoed (Creativiteit): </w:t>
+      </w:r>
+      <w:r>
+        <w:rPr>
+          <w:rFonts w:ascii="Arial" w:hAnsi="Arial" w:cs="Arial"/>
+        </w:rPr>
+        <w:t xml:space="preserve">Ik heb de afsluiting van mijn brief creatiever en actiever gemaakt ("Graag kom ik mijn motivatie nader toelichten...") en mijn specifieke rol bij het veilingwebsite-project (front-end van het dashboard) extra benadrukt. </w:t>
+      </w:r>
+    </w:p>
+    <w:p>
+      <w:pPr>
+        <w:pStyle w:val="Normaalweb"/>
+        <w:rPr>
+          <w:rFonts w:ascii="Arial" w:hAnsi="Arial" w:cs="Arial"/>
+          <w:b/>
+          <w:bCs/>
+        </w:rPr>
+      </w:pPr>
+      <w:r>
+        <w:rPr>
+          <w:rFonts w:ascii="Arial" w:hAnsi="Arial" w:cs="Arial"/>
+          <w:b/>
+          <w:bCs/>
+        </w:rPr>
+        <w:t>3. Toepassing op mijn CV:</w:t>
+      </w:r>
+    </w:p>
+    <w:p>
+      <w:pPr>
+        <w:pStyle w:val="Normaalweb"/>
+        <w:numPr>
+          <w:ilvl w:val="0"/>
+          <w:numId w:val="30"/>
+        </w:numPr>
+        <w:rPr>
+          <w:rFonts w:ascii="Arial" w:hAnsi="Arial" w:cs="Arial"/>
+          <w:b/>
+          <w:bCs/>
+        </w:rPr>
+      </w:pPr>
+      <w:r>
+        <w:rPr>
+          <w:rFonts w:ascii="Arial" w:hAnsi="Arial" w:cs="Arial"/>
+          <w:b/>
+          <w:bCs/>
+        </w:rPr>
+        <w:t xml:space="preserve">Witte hoed (Feiten): </w:t>
+      </w:r>
+      <w:r>
+        <w:rPr>
+          <w:rFonts w:ascii="Arial" w:hAnsi="Arial" w:cs="Arial"/>
+        </w:rPr>
+        <w:t xml:space="preserve">Mijn CV bevat alle feitelijke informatie over mijn opleidingen, werkervaring en ICT-vaardigheden. </w:t>
+      </w:r>
+    </w:p>
+    <w:p>
+      <w:pPr>
+        <w:pStyle w:val="Normaalweb"/>
+        <w:numPr>
+          <w:ilvl w:val="0"/>
+          <w:numId w:val="30"/>
+        </w:numPr>
+        <w:rPr>
+          <w:rFonts w:ascii="Arial" w:hAnsi="Arial" w:cs="Arial"/>
+          <w:b/>
+          <w:bCs/>
+        </w:rPr>
+      </w:pPr>
+      <w:r>
+        <w:rPr>
+          <w:rFonts w:ascii="Arial" w:hAnsi="Arial" w:cs="Arial"/>
+          <w:b/>
+          <w:bCs/>
+        </w:rPr>
+        <w:t xml:space="preserve">Zwarte hoed (Kritisch): </w:t>
+      </w:r>
+      <w:r>
+        <w:rPr>
+          <w:rFonts w:ascii="Arial" w:hAnsi="Arial" w:cs="Arial"/>
+        </w:rPr>
+        <w:t>Ik realiseerde me dat het gebruik van grafische 'bolletjes' of statusbalkjes voor mijn vaardigheden eigenlijk niets zegt over mijn daadwerkelijke kennisniveau. Het maakte het CV alleen maar onoverzichtelijk.</w:t>
+      </w:r>
+      <w:r>
+        <w:rPr>
+          <w:rFonts w:ascii="Arial" w:hAnsi="Arial" w:cs="Arial"/>
+          <w:b/>
+          <w:bCs/>
+        </w:rPr>
+        <w:t xml:space="preserve"> </w:t>
+      </w:r>
+    </w:p>
+    <w:p>
+      <w:pPr>
+        <w:pStyle w:val="Normaalweb"/>
+        <w:numPr>
+          <w:ilvl w:val="0"/>
+          <w:numId w:val="30"/>
+        </w:numPr>
+        <w:rPr>
+          <w:rFonts w:ascii="Arial" w:hAnsi="Arial" w:cs="Arial"/>
+          <w:b/>
+          <w:bCs/>
+        </w:rPr>
+      </w:pPr>
+      <w:r>
+        <w:rPr>
+          <w:rFonts w:ascii="Arial" w:hAnsi="Arial" w:cs="Arial"/>
+          <w:b/>
+          <w:bCs/>
+        </w:rPr>
+        <w:t xml:space="preserve">Groene hoed (Creativiteit): </w:t>
+      </w:r>
+      <w:r>
+        <w:rPr>
+          <w:rFonts w:ascii="Arial" w:hAnsi="Arial" w:cs="Arial"/>
+        </w:rPr>
+        <w:t>Ik heb de vage bolletjes volledig verwijderd en vervangen door duidelijke, professionele terminologie zoals 'beginner' en 'gemiddeld'. Daarnaast heb ik een professionele profieltekst toegevoegd en duidelijke kleurvlakken (zoals donkerblauw) gebruikt om de verschillende secties visueel van elkaar te scheiden, waardoor het document overzichtelijk en aantrekkelijk blijft.</w:t>
+      </w:r>
+    </w:p>
+    <w:p>
+      <w:pPr>
+        <w:pStyle w:val="Normaalweb"/>
+        <w:spacing w:before="0" w:beforeAutospacing="0"/>
+        <w:rPr>
+          <w:rFonts w:ascii="Arial" w:hAnsi="Arial" w:cs="Arial"/>
+        </w:rPr>
+      </w:pPr>
+      <w:r>
+        <w:rPr>
+          <w:rFonts w:ascii="Arial" w:hAnsi="Arial" w:cs="Arial"/>
+          <w:b/>
+          <w:bCs/>
+        </w:rPr>
         <w:t>C. Nabespreken: Netwerken (Mindmap &amp; Tips)</w:t>
       </w:r>
       <w:r>
@@ -9835,7 +10182,7 @@
     </w:p>
     <w:p>
       <w:pPr>
-        <w:pStyle w:val="NormalWeb"/>
+        <w:pStyle w:val="Normaalweb"/>
         <w:numPr>
           <w:ilvl w:val="0"/>
           <w:numId w:val="16"/>
@@ -9870,7 +10217,7 @@
     </w:p>
     <w:p>
       <w:pPr>
-        <w:pStyle w:val="NormalWeb"/>
+        <w:pStyle w:val="Normaalweb"/>
         <w:numPr>
           <w:ilvl w:val="0"/>
           <w:numId w:val="16"/>
@@ -9887,7 +10234,6 @@
           <w:b/>
           <w:bCs/>
         </w:rPr>
-        <w:lastRenderedPageBreak/>
         <w:t>LinkedIn updaten:</w:t>
       </w:r>
       <w:r>
@@ -9927,7 +10273,7 @@
     </w:p>
     <w:p>
       <w:pPr>
-        <w:pStyle w:val="Heading2"/>
+        <w:pStyle w:val="Kop2"/>
       </w:pPr>
       <w:bookmarkStart w:id="41" w:name="_Toc228830626"/>
       <w:r>
@@ -10013,7 +10359,7 @@
     </w:p>
     <w:p>
       <w:pPr>
-        <w:pStyle w:val="Heading2"/>
+        <w:pStyle w:val="Kop2"/>
       </w:pPr>
       <w:bookmarkStart w:id="42" w:name="_Toc228830627"/>
       <w:r>
@@ -10249,7 +10595,7 @@
     <w:p>
       <w:pPr>
         <w:rPr>
-          <w:rStyle w:val="Heading2Char"/>
+          <w:rStyle w:val="Kop2Char"/>
         </w:rPr>
       </w:pPr>
       <w:r>
@@ -10262,7 +10608,7 @@
       </w:r>
       <w:r>
         <w:rPr>
-          <w:rStyle w:val="Heading2Char"/>
+          <w:rStyle w:val="Kop2Char"/>
         </w:rPr>
         <w:t>Reflectie: Wat heb ik geleerd?</w:t>
       </w:r>
@@ -10415,7 +10761,7 @@
     </w:p>
     <w:p>
       <w:pPr>
-        <w:pStyle w:val="Heading2"/>
+        <w:pStyle w:val="Kop2"/>
       </w:pPr>
       <w:bookmarkStart w:id="43" w:name="_Toc228830628"/>
       <w:r>
@@ -10710,7 +11056,7 @@
       </w:r>
       <w:r>
         <w:rPr>
-          <w:rStyle w:val="Heading2Char"/>
+          <w:rStyle w:val="Kop2Char"/>
         </w:rPr>
         <w:t xml:space="preserve"> Reflectie: Wat heb ik geleerd?</w:t>
       </w:r>
@@ -10858,7 +11204,7 @@
     </w:p>
     <w:p>
       <w:pPr>
-        <w:pStyle w:val="ListParagraph"/>
+        <w:pStyle w:val="Lijstalinea"/>
         <w:numPr>
           <w:ilvl w:val="0"/>
           <w:numId w:val="24"/>
@@ -10870,7 +11216,7 @@
       <w:bookmarkStart w:id="44" w:name="_Toc228830629"/>
       <w:r>
         <w:rPr>
-          <w:rStyle w:val="Heading2Char"/>
+          <w:rStyle w:val="Kop2Char"/>
         </w:rPr>
         <w:t>LinkedIn Profiel</w:t>
       </w:r>
@@ -10884,7 +11230,7 @@
     </w:p>
     <w:p>
       <w:pPr>
-        <w:pStyle w:val="ListParagraph"/>
+        <w:pStyle w:val="Lijstalinea"/>
         <w:rPr>
           <w:rFonts w:ascii="Arial" w:hAnsi="Arial" w:cs="Arial"/>
           <w:b/>
@@ -10894,7 +11240,7 @@
     </w:p>
     <w:p>
       <w:pPr>
-        <w:pStyle w:val="ListParagraph"/>
+        <w:pStyle w:val="Lijstalinea"/>
         <w:rPr>
           <w:rFonts w:ascii="Arial" w:hAnsi="Arial" w:cs="Arial"/>
         </w:rPr>
@@ -11233,7 +11579,7 @@
       </w:r>
       <w:r>
         <w:rPr>
-          <w:rStyle w:val="Heading2Char"/>
+          <w:rStyle w:val="Kop2Char"/>
         </w:rPr>
         <w:t>Wat heb ik vandaag geleerd?</w:t>
       </w:r>
@@ -11263,7 +11609,7 @@
     <w:p>
       <w:pPr>
         <w:rPr>
-          <w:rStyle w:val="Heading2Char"/>
+          <w:rStyle w:val="Kop2Char"/>
         </w:rPr>
       </w:pPr>
       <w:bookmarkStart w:id="45" w:name="_Toc228830630"/>
@@ -11271,14 +11617,14 @@
     <w:p>
       <w:pPr>
         <w:rPr>
-          <w:rStyle w:val="Heading2Char"/>
-        </w:rPr>
-      </w:pPr>
-    </w:p>
-    <w:p>
-      <w:pPr>
-        <w:rPr>
-          <w:rStyle w:val="Heading2Char"/>
+          <w:rStyle w:val="Kop2Char"/>
+        </w:rPr>
+      </w:pPr>
+    </w:p>
+    <w:p>
+      <w:pPr>
+        <w:rPr>
+          <w:rStyle w:val="Kop2Char"/>
         </w:rPr>
       </w:pPr>
     </w:p>
@@ -12785,6 +13131,155 @@
     </w:lvl>
   </w:abstractNum>
   <w:abstractNum w:abstractNumId="5" w15:restartNumberingAfterBreak="0">
+    <w:nsid w:val="100E1CE4"/>
+    <w:multiLevelType w:val="multilevel"/>
+    <w:tmpl w:val="35148B8C"/>
+    <w:lvl w:ilvl="0">
+      <w:start w:val="1"/>
+      <w:numFmt w:val="bullet"/>
+      <w:lvlText w:val=""/>
+      <w:lvlJc w:val="left"/>
+      <w:pPr>
+        <w:tabs>
+          <w:tab w:val="num" w:pos="720"/>
+        </w:tabs>
+        <w:ind w:left="720" w:hanging="360"/>
+      </w:pPr>
+      <w:rPr>
+        <w:rFonts w:ascii="Symbol" w:hAnsi="Symbol" w:hint="default"/>
+        <w:sz w:val="20"/>
+      </w:rPr>
+    </w:lvl>
+    <w:lvl w:ilvl="1" w:tentative="1">
+      <w:start w:val="1"/>
+      <w:numFmt w:val="bullet"/>
+      <w:lvlText w:val="o"/>
+      <w:lvlJc w:val="left"/>
+      <w:pPr>
+        <w:tabs>
+          <w:tab w:val="num" w:pos="1440"/>
+        </w:tabs>
+        <w:ind w:left="1440" w:hanging="360"/>
+      </w:pPr>
+      <w:rPr>
+        <w:rFonts w:ascii="Courier New" w:hAnsi="Courier New" w:hint="default"/>
+        <w:sz w:val="20"/>
+      </w:rPr>
+    </w:lvl>
+    <w:lvl w:ilvl="2" w:tentative="1">
+      <w:start w:val="1"/>
+      <w:numFmt w:val="bullet"/>
+      <w:lvlText w:val=""/>
+      <w:lvlJc w:val="left"/>
+      <w:pPr>
+        <w:tabs>
+          <w:tab w:val="num" w:pos="2160"/>
+        </w:tabs>
+        <w:ind w:left="2160" w:hanging="360"/>
+      </w:pPr>
+      <w:rPr>
+        <w:rFonts w:ascii="Wingdings" w:hAnsi="Wingdings" w:hint="default"/>
+        <w:sz w:val="20"/>
+      </w:rPr>
+    </w:lvl>
+    <w:lvl w:ilvl="3" w:tentative="1">
+      <w:start w:val="1"/>
+      <w:numFmt w:val="bullet"/>
+      <w:lvlText w:val=""/>
+      <w:lvlJc w:val="left"/>
+      <w:pPr>
+        <w:tabs>
+          <w:tab w:val="num" w:pos="2880"/>
+        </w:tabs>
+        <w:ind w:left="2880" w:hanging="360"/>
+      </w:pPr>
+      <w:rPr>
+        <w:rFonts w:ascii="Wingdings" w:hAnsi="Wingdings" w:hint="default"/>
+        <w:sz w:val="20"/>
+      </w:rPr>
+    </w:lvl>
+    <w:lvl w:ilvl="4" w:tentative="1">
+      <w:start w:val="1"/>
+      <w:numFmt w:val="bullet"/>
+      <w:lvlText w:val=""/>
+      <w:lvlJc w:val="left"/>
+      <w:pPr>
+        <w:tabs>
+          <w:tab w:val="num" w:pos="3600"/>
+        </w:tabs>
+        <w:ind w:left="3600" w:hanging="360"/>
+      </w:pPr>
+      <w:rPr>
+        <w:rFonts w:ascii="Wingdings" w:hAnsi="Wingdings" w:hint="default"/>
+        <w:sz w:val="20"/>
+      </w:rPr>
+    </w:lvl>
+    <w:lvl w:ilvl="5" w:tentative="1">
+      <w:start w:val="1"/>
+      <w:numFmt w:val="bullet"/>
+      <w:lvlText w:val=""/>
+      <w:lvlJc w:val="left"/>
+      <w:pPr>
+        <w:tabs>
+          <w:tab w:val="num" w:pos="4320"/>
+        </w:tabs>
+        <w:ind w:left="4320" w:hanging="360"/>
+      </w:pPr>
+      <w:rPr>
+        <w:rFonts w:ascii="Wingdings" w:hAnsi="Wingdings" w:hint="default"/>
+        <w:sz w:val="20"/>
+      </w:rPr>
+    </w:lvl>
+    <w:lvl w:ilvl="6" w:tentative="1">
+      <w:start w:val="1"/>
+      <w:numFmt w:val="bullet"/>
+      <w:lvlText w:val=""/>
+      <w:lvlJc w:val="left"/>
+      <w:pPr>
+        <w:tabs>
+          <w:tab w:val="num" w:pos="5040"/>
+        </w:tabs>
+        <w:ind w:left="5040" w:hanging="360"/>
+      </w:pPr>
+      <w:rPr>
+        <w:rFonts w:ascii="Wingdings" w:hAnsi="Wingdings" w:hint="default"/>
+        <w:sz w:val="20"/>
+      </w:rPr>
+    </w:lvl>
+    <w:lvl w:ilvl="7" w:tentative="1">
+      <w:start w:val="1"/>
+      <w:numFmt w:val="bullet"/>
+      <w:lvlText w:val=""/>
+      <w:lvlJc w:val="left"/>
+      <w:pPr>
+        <w:tabs>
+          <w:tab w:val="num" w:pos="5760"/>
+        </w:tabs>
+        <w:ind w:left="5760" w:hanging="360"/>
+      </w:pPr>
+      <w:rPr>
+        <w:rFonts w:ascii="Wingdings" w:hAnsi="Wingdings" w:hint="default"/>
+        <w:sz w:val="20"/>
+      </w:rPr>
+    </w:lvl>
+    <w:lvl w:ilvl="8" w:tentative="1">
+      <w:start w:val="1"/>
+      <w:numFmt w:val="bullet"/>
+      <w:lvlText w:val=""/>
+      <w:lvlJc w:val="left"/>
+      <w:pPr>
+        <w:tabs>
+          <w:tab w:val="num" w:pos="6480"/>
+        </w:tabs>
+        <w:ind w:left="6480" w:hanging="360"/>
+      </w:pPr>
+      <w:rPr>
+        <w:rFonts w:ascii="Wingdings" w:hAnsi="Wingdings" w:hint="default"/>
+        <w:sz w:val="20"/>
+      </w:rPr>
+    </w:lvl>
+  </w:abstractNum>
+  <w:abstractNum w:abstractNumId="6" w15:restartNumberingAfterBreak="0">
     <w:nsid w:val="14AE0FA2"/>
     <w:multiLevelType w:val="multilevel"/>
     <w:tmpl w:val="D53E3812"/>
@@ -12933,7 +13428,156 @@
       </w:rPr>
     </w:lvl>
   </w:abstractNum>
-  <w:abstractNum w:abstractNumId="6" w15:restartNumberingAfterBreak="0">
+  <w:abstractNum w:abstractNumId="7" w15:restartNumberingAfterBreak="0">
+    <w:nsid w:val="158C5497"/>
+    <w:multiLevelType w:val="multilevel"/>
+    <w:tmpl w:val="D26863EE"/>
+    <w:lvl w:ilvl="0">
+      <w:start w:val="1"/>
+      <w:numFmt w:val="bullet"/>
+      <w:lvlText w:val=""/>
+      <w:lvlJc w:val="left"/>
+      <w:pPr>
+        <w:tabs>
+          <w:tab w:val="num" w:pos="720"/>
+        </w:tabs>
+        <w:ind w:left="720" w:hanging="360"/>
+      </w:pPr>
+      <w:rPr>
+        <w:rFonts w:ascii="Symbol" w:hAnsi="Symbol" w:hint="default"/>
+        <w:sz w:val="20"/>
+      </w:rPr>
+    </w:lvl>
+    <w:lvl w:ilvl="1" w:tentative="1">
+      <w:start w:val="1"/>
+      <w:numFmt w:val="bullet"/>
+      <w:lvlText w:val="o"/>
+      <w:lvlJc w:val="left"/>
+      <w:pPr>
+        <w:tabs>
+          <w:tab w:val="num" w:pos="1440"/>
+        </w:tabs>
+        <w:ind w:left="1440" w:hanging="360"/>
+      </w:pPr>
+      <w:rPr>
+        <w:rFonts w:ascii="Courier New" w:hAnsi="Courier New" w:hint="default"/>
+        <w:sz w:val="20"/>
+      </w:rPr>
+    </w:lvl>
+    <w:lvl w:ilvl="2" w:tentative="1">
+      <w:start w:val="1"/>
+      <w:numFmt w:val="bullet"/>
+      <w:lvlText w:val=""/>
+      <w:lvlJc w:val="left"/>
+      <w:pPr>
+        <w:tabs>
+          <w:tab w:val="num" w:pos="2160"/>
+        </w:tabs>
+        <w:ind w:left="2160" w:hanging="360"/>
+      </w:pPr>
+      <w:rPr>
+        <w:rFonts w:ascii="Wingdings" w:hAnsi="Wingdings" w:hint="default"/>
+        <w:sz w:val="20"/>
+      </w:rPr>
+    </w:lvl>
+    <w:lvl w:ilvl="3" w:tentative="1">
+      <w:start w:val="1"/>
+      <w:numFmt w:val="bullet"/>
+      <w:lvlText w:val=""/>
+      <w:lvlJc w:val="left"/>
+      <w:pPr>
+        <w:tabs>
+          <w:tab w:val="num" w:pos="2880"/>
+        </w:tabs>
+        <w:ind w:left="2880" w:hanging="360"/>
+      </w:pPr>
+      <w:rPr>
+        <w:rFonts w:ascii="Wingdings" w:hAnsi="Wingdings" w:hint="default"/>
+        <w:sz w:val="20"/>
+      </w:rPr>
+    </w:lvl>
+    <w:lvl w:ilvl="4" w:tentative="1">
+      <w:start w:val="1"/>
+      <w:numFmt w:val="bullet"/>
+      <w:lvlText w:val=""/>
+      <w:lvlJc w:val="left"/>
+      <w:pPr>
+        <w:tabs>
+          <w:tab w:val="num" w:pos="3600"/>
+        </w:tabs>
+        <w:ind w:left="3600" w:hanging="360"/>
+      </w:pPr>
+      <w:rPr>
+        <w:rFonts w:ascii="Wingdings" w:hAnsi="Wingdings" w:hint="default"/>
+        <w:sz w:val="20"/>
+      </w:rPr>
+    </w:lvl>
+    <w:lvl w:ilvl="5" w:tentative="1">
+      <w:start w:val="1"/>
+      <w:numFmt w:val="bullet"/>
+      <w:lvlText w:val=""/>
+      <w:lvlJc w:val="left"/>
+      <w:pPr>
+        <w:tabs>
+          <w:tab w:val="num" w:pos="4320"/>
+        </w:tabs>
+        <w:ind w:left="4320" w:hanging="360"/>
+      </w:pPr>
+      <w:rPr>
+        <w:rFonts w:ascii="Wingdings" w:hAnsi="Wingdings" w:hint="default"/>
+        <w:sz w:val="20"/>
+      </w:rPr>
+    </w:lvl>
+    <w:lvl w:ilvl="6" w:tentative="1">
+      <w:start w:val="1"/>
+      <w:numFmt w:val="bullet"/>
+      <w:lvlText w:val=""/>
+      <w:lvlJc w:val="left"/>
+      <w:pPr>
+        <w:tabs>
+          <w:tab w:val="num" w:pos="5040"/>
+        </w:tabs>
+        <w:ind w:left="5040" w:hanging="360"/>
+      </w:pPr>
+      <w:rPr>
+        <w:rFonts w:ascii="Wingdings" w:hAnsi="Wingdings" w:hint="default"/>
+        <w:sz w:val="20"/>
+      </w:rPr>
+    </w:lvl>
+    <w:lvl w:ilvl="7" w:tentative="1">
+      <w:start w:val="1"/>
+      <w:numFmt w:val="bullet"/>
+      <w:lvlText w:val=""/>
+      <w:lvlJc w:val="left"/>
+      <w:pPr>
+        <w:tabs>
+          <w:tab w:val="num" w:pos="5760"/>
+        </w:tabs>
+        <w:ind w:left="5760" w:hanging="360"/>
+      </w:pPr>
+      <w:rPr>
+        <w:rFonts w:ascii="Wingdings" w:hAnsi="Wingdings" w:hint="default"/>
+        <w:sz w:val="20"/>
+      </w:rPr>
+    </w:lvl>
+    <w:lvl w:ilvl="8" w:tentative="1">
+      <w:start w:val="1"/>
+      <w:numFmt w:val="bullet"/>
+      <w:lvlText w:val=""/>
+      <w:lvlJc w:val="left"/>
+      <w:pPr>
+        <w:tabs>
+          <w:tab w:val="num" w:pos="6480"/>
+        </w:tabs>
+        <w:ind w:left="6480" w:hanging="360"/>
+      </w:pPr>
+      <w:rPr>
+        <w:rFonts w:ascii="Wingdings" w:hAnsi="Wingdings" w:hint="default"/>
+        <w:sz w:val="20"/>
+      </w:rPr>
+    </w:lvl>
+  </w:abstractNum>
+  <w:abstractNum w:abstractNumId="8" w15:restartNumberingAfterBreak="0">
     <w:nsid w:val="188440D2"/>
     <w:multiLevelType w:val="multilevel"/>
     <w:tmpl w:val="0520E618"/>
@@ -13082,7 +13726,7 @@
       </w:rPr>
     </w:lvl>
   </w:abstractNum>
-  <w:abstractNum w:abstractNumId="7" w15:restartNumberingAfterBreak="0">
+  <w:abstractNum w:abstractNumId="9" w15:restartNumberingAfterBreak="0">
     <w:nsid w:val="1AFF584C"/>
     <w:multiLevelType w:val="multilevel"/>
     <w:tmpl w:val="43C8A7A0"/>
@@ -13231,7 +13875,7 @@
       </w:rPr>
     </w:lvl>
   </w:abstractNum>
-  <w:abstractNum w:abstractNumId="8" w15:restartNumberingAfterBreak="0">
+  <w:abstractNum w:abstractNumId="10" w15:restartNumberingAfterBreak="0">
     <w:nsid w:val="2769138B"/>
     <w:multiLevelType w:val="multilevel"/>
     <w:tmpl w:val="F3280CBE"/>
@@ -13380,7 +14024,156 @@
       </w:rPr>
     </w:lvl>
   </w:abstractNum>
-  <w:abstractNum w:abstractNumId="9" w15:restartNumberingAfterBreak="0">
+  <w:abstractNum w:abstractNumId="11" w15:restartNumberingAfterBreak="0">
+    <w:nsid w:val="3B5B5682"/>
+    <w:multiLevelType w:val="multilevel"/>
+    <w:tmpl w:val="E78A4034"/>
+    <w:lvl w:ilvl="0">
+      <w:start w:val="1"/>
+      <w:numFmt w:val="bullet"/>
+      <w:lvlText w:val=""/>
+      <w:lvlJc w:val="left"/>
+      <w:pPr>
+        <w:tabs>
+          <w:tab w:val="num" w:pos="720"/>
+        </w:tabs>
+        <w:ind w:left="720" w:hanging="360"/>
+      </w:pPr>
+      <w:rPr>
+        <w:rFonts w:ascii="Symbol" w:hAnsi="Symbol" w:hint="default"/>
+        <w:sz w:val="20"/>
+      </w:rPr>
+    </w:lvl>
+    <w:lvl w:ilvl="1" w:tentative="1">
+      <w:start w:val="1"/>
+      <w:numFmt w:val="bullet"/>
+      <w:lvlText w:val="o"/>
+      <w:lvlJc w:val="left"/>
+      <w:pPr>
+        <w:tabs>
+          <w:tab w:val="num" w:pos="1440"/>
+        </w:tabs>
+        <w:ind w:left="1440" w:hanging="360"/>
+      </w:pPr>
+      <w:rPr>
+        <w:rFonts w:ascii="Courier New" w:hAnsi="Courier New" w:hint="default"/>
+        <w:sz w:val="20"/>
+      </w:rPr>
+    </w:lvl>
+    <w:lvl w:ilvl="2" w:tentative="1">
+      <w:start w:val="1"/>
+      <w:numFmt w:val="bullet"/>
+      <w:lvlText w:val=""/>
+      <w:lvlJc w:val="left"/>
+      <w:pPr>
+        <w:tabs>
+          <w:tab w:val="num" w:pos="2160"/>
+        </w:tabs>
+        <w:ind w:left="2160" w:hanging="360"/>
+      </w:pPr>
+      <w:rPr>
+        <w:rFonts w:ascii="Wingdings" w:hAnsi="Wingdings" w:hint="default"/>
+        <w:sz w:val="20"/>
+      </w:rPr>
+    </w:lvl>
+    <w:lvl w:ilvl="3" w:tentative="1">
+      <w:start w:val="1"/>
+      <w:numFmt w:val="bullet"/>
+      <w:lvlText w:val=""/>
+      <w:lvlJc w:val="left"/>
+      <w:pPr>
+        <w:tabs>
+          <w:tab w:val="num" w:pos="2880"/>
+        </w:tabs>
+        <w:ind w:left="2880" w:hanging="360"/>
+      </w:pPr>
+      <w:rPr>
+        <w:rFonts w:ascii="Wingdings" w:hAnsi="Wingdings" w:hint="default"/>
+        <w:sz w:val="20"/>
+      </w:rPr>
+    </w:lvl>
+    <w:lvl w:ilvl="4" w:tentative="1">
+      <w:start w:val="1"/>
+      <w:numFmt w:val="bullet"/>
+      <w:lvlText w:val=""/>
+      <w:lvlJc w:val="left"/>
+      <w:pPr>
+        <w:tabs>
+          <w:tab w:val="num" w:pos="3600"/>
+        </w:tabs>
+        <w:ind w:left="3600" w:hanging="360"/>
+      </w:pPr>
+      <w:rPr>
+        <w:rFonts w:ascii="Wingdings" w:hAnsi="Wingdings" w:hint="default"/>
+        <w:sz w:val="20"/>
+      </w:rPr>
+    </w:lvl>
+    <w:lvl w:ilvl="5" w:tentative="1">
+      <w:start w:val="1"/>
+      <w:numFmt w:val="bullet"/>
+      <w:lvlText w:val=""/>
+      <w:lvlJc w:val="left"/>
+      <w:pPr>
+        <w:tabs>
+          <w:tab w:val="num" w:pos="4320"/>
+        </w:tabs>
+        <w:ind w:left="4320" w:hanging="360"/>
+      </w:pPr>
+      <w:rPr>
+        <w:rFonts w:ascii="Wingdings" w:hAnsi="Wingdings" w:hint="default"/>
+        <w:sz w:val="20"/>
+      </w:rPr>
+    </w:lvl>
+    <w:lvl w:ilvl="6" w:tentative="1">
+      <w:start w:val="1"/>
+      <w:numFmt w:val="bullet"/>
+      <w:lvlText w:val=""/>
+      <w:lvlJc w:val="left"/>
+      <w:pPr>
+        <w:tabs>
+          <w:tab w:val="num" w:pos="5040"/>
+        </w:tabs>
+        <w:ind w:left="5040" w:hanging="360"/>
+      </w:pPr>
+      <w:rPr>
+        <w:rFonts w:ascii="Wingdings" w:hAnsi="Wingdings" w:hint="default"/>
+        <w:sz w:val="20"/>
+      </w:rPr>
+    </w:lvl>
+    <w:lvl w:ilvl="7" w:tentative="1">
+      <w:start w:val="1"/>
+      <w:numFmt w:val="bullet"/>
+      <w:lvlText w:val=""/>
+      <w:lvlJc w:val="left"/>
+      <w:pPr>
+        <w:tabs>
+          <w:tab w:val="num" w:pos="5760"/>
+        </w:tabs>
+        <w:ind w:left="5760" w:hanging="360"/>
+      </w:pPr>
+      <w:rPr>
+        <w:rFonts w:ascii="Wingdings" w:hAnsi="Wingdings" w:hint="default"/>
+        <w:sz w:val="20"/>
+      </w:rPr>
+    </w:lvl>
+    <w:lvl w:ilvl="8" w:tentative="1">
+      <w:start w:val="1"/>
+      <w:numFmt w:val="bullet"/>
+      <w:lvlText w:val=""/>
+      <w:lvlJc w:val="left"/>
+      <w:pPr>
+        <w:tabs>
+          <w:tab w:val="num" w:pos="6480"/>
+        </w:tabs>
+        <w:ind w:left="6480" w:hanging="360"/>
+      </w:pPr>
+      <w:rPr>
+        <w:rFonts w:ascii="Wingdings" w:hAnsi="Wingdings" w:hint="default"/>
+        <w:sz w:val="20"/>
+      </w:rPr>
+    </w:lvl>
+  </w:abstractNum>
+  <w:abstractNum w:abstractNumId="12" w15:restartNumberingAfterBreak="0">
     <w:nsid w:val="3F5969EC"/>
     <w:multiLevelType w:val="multilevel"/>
     <w:tmpl w:val="A2A05958"/>
@@ -13529,7 +14322,7 @@
       </w:rPr>
     </w:lvl>
   </w:abstractNum>
-  <w:abstractNum w:abstractNumId="10" w15:restartNumberingAfterBreak="0">
+  <w:abstractNum w:abstractNumId="13" w15:restartNumberingAfterBreak="0">
     <w:nsid w:val="40E4294C"/>
     <w:multiLevelType w:val="multilevel"/>
     <w:tmpl w:val="E562A3A0"/>
@@ -13678,7 +14471,7 @@
       </w:rPr>
     </w:lvl>
   </w:abstractNum>
-  <w:abstractNum w:abstractNumId="11" w15:restartNumberingAfterBreak="0">
+  <w:abstractNum w:abstractNumId="14" w15:restartNumberingAfterBreak="0">
     <w:nsid w:val="42BB4271"/>
     <w:multiLevelType w:val="multilevel"/>
     <w:tmpl w:val="3850C4D6"/>
@@ -13827,7 +14620,7 @@
       </w:rPr>
     </w:lvl>
   </w:abstractNum>
-  <w:abstractNum w:abstractNumId="12" w15:restartNumberingAfterBreak="0">
+  <w:abstractNum w:abstractNumId="15" w15:restartNumberingAfterBreak="0">
     <w:nsid w:val="442D2937"/>
     <w:multiLevelType w:val="multilevel"/>
     <w:tmpl w:val="BBBC93F8"/>
@@ -13976,7 +14769,7 @@
       </w:rPr>
     </w:lvl>
   </w:abstractNum>
-  <w:abstractNum w:abstractNumId="13" w15:restartNumberingAfterBreak="0">
+  <w:abstractNum w:abstractNumId="16" w15:restartNumberingAfterBreak="0">
     <w:nsid w:val="466E1FE7"/>
     <w:multiLevelType w:val="multilevel"/>
     <w:tmpl w:val="149CF4EE"/>
@@ -14125,7 +14918,7 @@
       </w:rPr>
     </w:lvl>
   </w:abstractNum>
-  <w:abstractNum w:abstractNumId="14" w15:restartNumberingAfterBreak="0">
+  <w:abstractNum w:abstractNumId="17" w15:restartNumberingAfterBreak="0">
     <w:nsid w:val="48CE575C"/>
     <w:multiLevelType w:val="hybridMultilevel"/>
     <w:tmpl w:val="68ACED06"/>
@@ -14215,7 +15008,7 @@
       </w:pPr>
     </w:lvl>
   </w:abstractNum>
-  <w:abstractNum w:abstractNumId="15" w15:restartNumberingAfterBreak="0">
+  <w:abstractNum w:abstractNumId="18" w15:restartNumberingAfterBreak="0">
     <w:nsid w:val="49A4577A"/>
     <w:multiLevelType w:val="multilevel"/>
     <w:tmpl w:val="49B4E814"/>
@@ -14364,7 +15157,7 @@
       </w:rPr>
     </w:lvl>
   </w:abstractNum>
-  <w:abstractNum w:abstractNumId="16" w15:restartNumberingAfterBreak="0">
+  <w:abstractNum w:abstractNumId="19" w15:restartNumberingAfterBreak="0">
     <w:nsid w:val="4C2027A6"/>
     <w:multiLevelType w:val="multilevel"/>
     <w:tmpl w:val="735C18D2"/>
@@ -14513,7 +15306,7 @@
       </w:rPr>
     </w:lvl>
   </w:abstractNum>
-  <w:abstractNum w:abstractNumId="17" w15:restartNumberingAfterBreak="0">
+  <w:abstractNum w:abstractNumId="20" w15:restartNumberingAfterBreak="0">
     <w:nsid w:val="520959B6"/>
     <w:multiLevelType w:val="multilevel"/>
     <w:tmpl w:val="B74A1E1A"/>
@@ -14662,7 +15455,7 @@
       </w:rPr>
     </w:lvl>
   </w:abstractNum>
-  <w:abstractNum w:abstractNumId="18" w15:restartNumberingAfterBreak="0">
+  <w:abstractNum w:abstractNumId="21" w15:restartNumberingAfterBreak="0">
     <w:nsid w:val="5BB335F4"/>
     <w:multiLevelType w:val="multilevel"/>
     <w:tmpl w:val="38184C72"/>
@@ -14811,7 +15604,7 @@
       </w:rPr>
     </w:lvl>
   </w:abstractNum>
-  <w:abstractNum w:abstractNumId="19" w15:restartNumberingAfterBreak="0">
+  <w:abstractNum w:abstractNumId="22" w15:restartNumberingAfterBreak="0">
     <w:nsid w:val="61A96268"/>
     <w:multiLevelType w:val="multilevel"/>
     <w:tmpl w:val="F0F69466"/>
@@ -14960,7 +15753,7 @@
       </w:rPr>
     </w:lvl>
   </w:abstractNum>
-  <w:abstractNum w:abstractNumId="20" w15:restartNumberingAfterBreak="0">
+  <w:abstractNum w:abstractNumId="23" w15:restartNumberingAfterBreak="0">
     <w:nsid w:val="668078A7"/>
     <w:multiLevelType w:val="multilevel"/>
     <w:tmpl w:val="F8383BE2"/>
@@ -15109,7 +15902,7 @@
       </w:rPr>
     </w:lvl>
   </w:abstractNum>
-  <w:abstractNum w:abstractNumId="21" w15:restartNumberingAfterBreak="0">
+  <w:abstractNum w:abstractNumId="24" w15:restartNumberingAfterBreak="0">
     <w:nsid w:val="681120CB"/>
     <w:multiLevelType w:val="multilevel"/>
     <w:tmpl w:val="61C658E6"/>
@@ -15258,7 +16051,7 @@
       </w:rPr>
     </w:lvl>
   </w:abstractNum>
-  <w:abstractNum w:abstractNumId="22" w15:restartNumberingAfterBreak="0">
+  <w:abstractNum w:abstractNumId="25" w15:restartNumberingAfterBreak="0">
     <w:nsid w:val="6EF2095E"/>
     <w:multiLevelType w:val="multilevel"/>
     <w:tmpl w:val="17CE8F5A"/>
@@ -15407,7 +16200,7 @@
       </w:rPr>
     </w:lvl>
   </w:abstractNum>
-  <w:abstractNum w:abstractNumId="23" w15:restartNumberingAfterBreak="0">
+  <w:abstractNum w:abstractNumId="26" w15:restartNumberingAfterBreak="0">
     <w:nsid w:val="75FE5FAD"/>
     <w:multiLevelType w:val="multilevel"/>
     <w:tmpl w:val="5EFE8B96"/>
@@ -15556,7 +16349,7 @@
       </w:rPr>
     </w:lvl>
   </w:abstractNum>
-  <w:abstractNum w:abstractNumId="24" w15:restartNumberingAfterBreak="0">
+  <w:abstractNum w:abstractNumId="27" w15:restartNumberingAfterBreak="0">
     <w:nsid w:val="7A7116E8"/>
     <w:multiLevelType w:val="multilevel"/>
     <w:tmpl w:val="DD48C220"/>
@@ -15669,7 +16462,7 @@
       </w:pPr>
     </w:lvl>
   </w:abstractNum>
-  <w:abstractNum w:abstractNumId="25" w15:restartNumberingAfterBreak="0">
+  <w:abstractNum w:abstractNumId="28" w15:restartNumberingAfterBreak="0">
     <w:nsid w:val="7E513FF0"/>
     <w:multiLevelType w:val="multilevel"/>
     <w:tmpl w:val="4880DB0C"/>
@@ -15818,7 +16611,7 @@
       </w:rPr>
     </w:lvl>
   </w:abstractNum>
-  <w:abstractNum w:abstractNumId="26" w15:restartNumberingAfterBreak="0">
+  <w:abstractNum w:abstractNumId="29" w15:restartNumberingAfterBreak="0">
     <w:nsid w:val="7FCC0D1A"/>
     <w:multiLevelType w:val="multilevel"/>
     <w:tmpl w:val="80F81D3E"/>
@@ -15971,82 +16764,91 @@
     <w:abstractNumId w:val="0"/>
   </w:num>
   <w:num w:numId="2" w16cid:durableId="252664054">
-    <w:abstractNumId w:val="8"/>
+    <w:abstractNumId w:val="10"/>
   </w:num>
   <w:num w:numId="3" w16cid:durableId="1191720210">
-    <w:abstractNumId w:val="5"/>
+    <w:abstractNumId w:val="6"/>
   </w:num>
   <w:num w:numId="4" w16cid:durableId="24869607">
-    <w:abstractNumId w:val="11"/>
+    <w:abstractNumId w:val="14"/>
   </w:num>
   <w:num w:numId="5" w16cid:durableId="410615721">
-    <w:abstractNumId w:val="12"/>
+    <w:abstractNumId w:val="15"/>
   </w:num>
   <w:num w:numId="6" w16cid:durableId="213079909">
-    <w:abstractNumId w:val="18"/>
+    <w:abstractNumId w:val="21"/>
   </w:num>
   <w:num w:numId="7" w16cid:durableId="314994594">
     <w:abstractNumId w:val="4"/>
   </w:num>
   <w:num w:numId="8" w16cid:durableId="1890261017">
-    <w:abstractNumId w:val="22"/>
+    <w:abstractNumId w:val="25"/>
   </w:num>
   <w:num w:numId="9" w16cid:durableId="212548633">
-    <w:abstractNumId w:val="9"/>
+    <w:abstractNumId w:val="12"/>
   </w:num>
   <w:num w:numId="10" w16cid:durableId="168953751">
+    <w:abstractNumId w:val="16"/>
+  </w:num>
+  <w:num w:numId="11" w16cid:durableId="1469392541">
     <w:abstractNumId w:val="13"/>
   </w:num>
-  <w:num w:numId="11" w16cid:durableId="1469392541">
-    <w:abstractNumId w:val="10"/>
-  </w:num>
   <w:num w:numId="12" w16cid:durableId="663778525">
-    <w:abstractNumId w:val="7"/>
+    <w:abstractNumId w:val="9"/>
   </w:num>
   <w:num w:numId="13" w16cid:durableId="60686770">
     <w:abstractNumId w:val="3"/>
   </w:num>
   <w:num w:numId="14" w16cid:durableId="760024601">
+    <w:abstractNumId w:val="26"/>
+  </w:num>
+  <w:num w:numId="15" w16cid:durableId="1344939569">
     <w:abstractNumId w:val="23"/>
   </w:num>
-  <w:num w:numId="15" w16cid:durableId="1344939569">
+  <w:num w:numId="16" w16cid:durableId="319623750">
     <w:abstractNumId w:val="20"/>
   </w:num>
-  <w:num w:numId="16" w16cid:durableId="319623750">
-    <w:abstractNumId w:val="17"/>
-  </w:num>
   <w:num w:numId="17" w16cid:durableId="520894717">
-    <w:abstractNumId w:val="26"/>
+    <w:abstractNumId w:val="29"/>
   </w:num>
   <w:num w:numId="18" w16cid:durableId="1043948287">
     <w:abstractNumId w:val="2"/>
   </w:num>
   <w:num w:numId="19" w16cid:durableId="1004819774">
+    <w:abstractNumId w:val="22"/>
+  </w:num>
+  <w:num w:numId="20" w16cid:durableId="1686906936">
+    <w:abstractNumId w:val="27"/>
+  </w:num>
+  <w:num w:numId="21" w16cid:durableId="1860195428">
+    <w:abstractNumId w:val="28"/>
+  </w:num>
+  <w:num w:numId="22" w16cid:durableId="1027950393">
     <w:abstractNumId w:val="19"/>
   </w:num>
-  <w:num w:numId="20" w16cid:durableId="1686906936">
-    <w:abstractNumId w:val="24"/>
-  </w:num>
-  <w:num w:numId="21" w16cid:durableId="1860195428">
-    <w:abstractNumId w:val="25"/>
-  </w:num>
-  <w:num w:numId="22" w16cid:durableId="1027950393">
-    <w:abstractNumId w:val="16"/>
-  </w:num>
   <w:num w:numId="23" w16cid:durableId="1981841135">
-    <w:abstractNumId w:val="6"/>
+    <w:abstractNumId w:val="8"/>
   </w:num>
   <w:num w:numId="24" w16cid:durableId="250705256">
-    <w:abstractNumId w:val="14"/>
+    <w:abstractNumId w:val="17"/>
   </w:num>
   <w:num w:numId="25" w16cid:durableId="2047482504">
-    <w:abstractNumId w:val="15"/>
+    <w:abstractNumId w:val="18"/>
   </w:num>
   <w:num w:numId="26" w16cid:durableId="23288556">
     <w:abstractNumId w:val="1"/>
   </w:num>
   <w:num w:numId="27" w16cid:durableId="1672903402">
-    <w:abstractNumId w:val="21"/>
+    <w:abstractNumId w:val="24"/>
+  </w:num>
+  <w:num w:numId="28" w16cid:durableId="294605253">
+    <w:abstractNumId w:val="5"/>
+  </w:num>
+  <w:num w:numId="29" w16cid:durableId="929581851">
+    <w:abstractNumId w:val="11"/>
+  </w:num>
+  <w:num w:numId="30" w16cid:durableId="390932916">
+    <w:abstractNumId w:val="7"/>
   </w:num>
 </w:numbering>
 </file>
@@ -16448,15 +17250,15 @@
     <w:lsdException w:name="Unresolved Mention" w:semiHidden="1" w:unhideWhenUsed="1"/>
     <w:lsdException w:name="Smart Link" w:semiHidden="1" w:unhideWhenUsed="1"/>
   </w:latentStyles>
-  <w:style w:type="paragraph" w:default="1" w:styleId="Normal">
+  <w:style w:type="paragraph" w:default="1" w:styleId="Standaard">
     <w:name w:val="Normal"/>
     <w:qFormat/>
   </w:style>
-  <w:style w:type="paragraph" w:styleId="Heading1">
+  <w:style w:type="paragraph" w:styleId="Kop1">
     <w:name w:val="heading 1"/>
-    <w:basedOn w:val="Normal"/>
-    <w:next w:val="Normal"/>
-    <w:link w:val="Heading1Char"/>
+    <w:basedOn w:val="Standaard"/>
+    <w:next w:val="Standaard"/>
+    <w:link w:val="Kop1Char"/>
     <w:uiPriority w:val="9"/>
     <w:qFormat/>
     <w:rsid w:val="00793935"/>
@@ -16473,11 +17275,11 @@
       <w:szCs w:val="40"/>
     </w:rPr>
   </w:style>
-  <w:style w:type="paragraph" w:styleId="Heading2">
+  <w:style w:type="paragraph" w:styleId="Kop2">
     <w:name w:val="heading 2"/>
-    <w:basedOn w:val="Normal"/>
-    <w:next w:val="Normal"/>
-    <w:link w:val="Heading2Char"/>
+    <w:basedOn w:val="Standaard"/>
+    <w:next w:val="Standaard"/>
+    <w:link w:val="Kop2Char"/>
     <w:uiPriority w:val="9"/>
     <w:unhideWhenUsed/>
     <w:qFormat/>
@@ -16495,11 +17297,11 @@
       <w:szCs w:val="32"/>
     </w:rPr>
   </w:style>
-  <w:style w:type="paragraph" w:styleId="Heading3">
+  <w:style w:type="paragraph" w:styleId="Kop3">
     <w:name w:val="heading 3"/>
-    <w:basedOn w:val="Normal"/>
-    <w:next w:val="Normal"/>
-    <w:link w:val="Heading3Char"/>
+    <w:basedOn w:val="Standaard"/>
+    <w:next w:val="Standaard"/>
+    <w:link w:val="Kop3Char"/>
     <w:uiPriority w:val="9"/>
     <w:unhideWhenUsed/>
     <w:qFormat/>
@@ -16517,11 +17319,11 @@
       <w:szCs w:val="28"/>
     </w:rPr>
   </w:style>
-  <w:style w:type="paragraph" w:styleId="Heading4">
+  <w:style w:type="paragraph" w:styleId="Kop4">
     <w:name w:val="heading 4"/>
-    <w:basedOn w:val="Normal"/>
-    <w:next w:val="Normal"/>
-    <w:link w:val="Heading4Char"/>
+    <w:basedOn w:val="Standaard"/>
+    <w:next w:val="Standaard"/>
+    <w:link w:val="Kop4Char"/>
     <w:uiPriority w:val="9"/>
     <w:semiHidden/>
     <w:unhideWhenUsed/>
@@ -16540,11 +17342,11 @@
       <w:color w:val="0F4761" w:themeColor="accent1" w:themeShade="BF"/>
     </w:rPr>
   </w:style>
-  <w:style w:type="paragraph" w:styleId="Heading5">
+  <w:style w:type="paragraph" w:styleId="Kop5">
     <w:name w:val="heading 5"/>
-    <w:basedOn w:val="Normal"/>
-    <w:next w:val="Normal"/>
-    <w:link w:val="Heading5Char"/>
+    <w:basedOn w:val="Standaard"/>
+    <w:next w:val="Standaard"/>
+    <w:link w:val="Kop5Char"/>
     <w:uiPriority w:val="9"/>
     <w:semiHidden/>
     <w:unhideWhenUsed/>
@@ -16561,11 +17363,11 @@
       <w:color w:val="0F4761" w:themeColor="accent1" w:themeShade="BF"/>
     </w:rPr>
   </w:style>
-  <w:style w:type="paragraph" w:styleId="Heading6">
+  <w:style w:type="paragraph" w:styleId="Kop6">
     <w:name w:val="heading 6"/>
-    <w:basedOn w:val="Normal"/>
-    <w:next w:val="Normal"/>
-    <w:link w:val="Heading6Char"/>
+    <w:basedOn w:val="Standaard"/>
+    <w:next w:val="Standaard"/>
+    <w:link w:val="Kop6Char"/>
     <w:uiPriority w:val="9"/>
     <w:semiHidden/>
     <w:unhideWhenUsed/>
@@ -16584,11 +17386,11 @@
       <w:color w:val="595959" w:themeColor="text1" w:themeTint="A6"/>
     </w:rPr>
   </w:style>
-  <w:style w:type="paragraph" w:styleId="Heading7">
+  <w:style w:type="paragraph" w:styleId="Kop7">
     <w:name w:val="heading 7"/>
-    <w:basedOn w:val="Normal"/>
-    <w:next w:val="Normal"/>
-    <w:link w:val="Heading7Char"/>
+    <w:basedOn w:val="Standaard"/>
+    <w:next w:val="Standaard"/>
+    <w:link w:val="Kop7Char"/>
     <w:uiPriority w:val="9"/>
     <w:semiHidden/>
     <w:unhideWhenUsed/>
@@ -16605,11 +17407,11 @@
       <w:color w:val="595959" w:themeColor="text1" w:themeTint="A6"/>
     </w:rPr>
   </w:style>
-  <w:style w:type="paragraph" w:styleId="Heading8">
+  <w:style w:type="paragraph" w:styleId="Kop8">
     <w:name w:val="heading 8"/>
-    <w:basedOn w:val="Normal"/>
-    <w:next w:val="Normal"/>
-    <w:link w:val="Heading8Char"/>
+    <w:basedOn w:val="Standaard"/>
+    <w:next w:val="Standaard"/>
+    <w:link w:val="Kop8Char"/>
     <w:uiPriority w:val="9"/>
     <w:semiHidden/>
     <w:unhideWhenUsed/>
@@ -16628,11 +17430,11 @@
       <w:color w:val="272727" w:themeColor="text1" w:themeTint="D8"/>
     </w:rPr>
   </w:style>
-  <w:style w:type="paragraph" w:styleId="Heading9">
+  <w:style w:type="paragraph" w:styleId="Kop9">
     <w:name w:val="heading 9"/>
-    <w:basedOn w:val="Normal"/>
-    <w:next w:val="Normal"/>
-    <w:link w:val="Heading9Char"/>
+    <w:basedOn w:val="Standaard"/>
+    <w:next w:val="Standaard"/>
+    <w:link w:val="Kop9Char"/>
     <w:uiPriority w:val="9"/>
     <w:semiHidden/>
     <w:unhideWhenUsed/>
@@ -16649,13 +17451,12 @@
       <w:color w:val="272727" w:themeColor="text1" w:themeTint="D8"/>
     </w:rPr>
   </w:style>
-  <w:style w:type="character" w:default="1" w:styleId="DefaultParagraphFont">
+  <w:style w:type="character" w:default="1" w:styleId="Standaardalinea-lettertype">
     <w:name w:val="Default Paragraph Font"/>
     <w:uiPriority w:val="1"/>
-    <w:semiHidden/>
     <w:unhideWhenUsed/>
   </w:style>
-  <w:style w:type="table" w:default="1" w:styleId="TableNormal">
+  <w:style w:type="table" w:default="1" w:styleId="Standaardtabel">
     <w:name w:val="Normal Table"/>
     <w:uiPriority w:val="99"/>
     <w:semiHidden/>
@@ -16670,16 +17471,16 @@
       </w:tblCellMar>
     </w:tblPr>
   </w:style>
-  <w:style w:type="numbering" w:default="1" w:styleId="NoList">
+  <w:style w:type="numbering" w:default="1" w:styleId="Geenlijst">
     <w:name w:val="No List"/>
     <w:uiPriority w:val="99"/>
     <w:semiHidden/>
     <w:unhideWhenUsed/>
   </w:style>
-  <w:style w:type="character" w:customStyle="1" w:styleId="Heading1Char">
-    <w:name w:val="Heading 1 Char"/>
-    <w:basedOn w:val="DefaultParagraphFont"/>
-    <w:link w:val="Heading1"/>
+  <w:style w:type="character" w:customStyle="1" w:styleId="Kop1Char">
+    <w:name w:val="Kop 1 Char"/>
+    <w:basedOn w:val="Standaardalinea-lettertype"/>
+    <w:link w:val="Kop1"/>
     <w:uiPriority w:val="9"/>
     <w:rsid w:val="00793935"/>
     <w:rPr>
@@ -16689,10 +17490,10 @@
       <w:szCs w:val="40"/>
     </w:rPr>
   </w:style>
-  <w:style w:type="character" w:customStyle="1" w:styleId="Heading2Char">
-    <w:name w:val="Heading 2 Char"/>
-    <w:basedOn w:val="DefaultParagraphFont"/>
-    <w:link w:val="Heading2"/>
+  <w:style w:type="character" w:customStyle="1" w:styleId="Kop2Char">
+    <w:name w:val="Kop 2 Char"/>
+    <w:basedOn w:val="Standaardalinea-lettertype"/>
+    <w:link w:val="Kop2"/>
     <w:uiPriority w:val="9"/>
     <w:rsid w:val="00793935"/>
     <w:rPr>
@@ -16702,10 +17503,10 @@
       <w:szCs w:val="32"/>
     </w:rPr>
   </w:style>
-  <w:style w:type="character" w:customStyle="1" w:styleId="Heading3Char">
-    <w:name w:val="Heading 3 Char"/>
-    <w:basedOn w:val="DefaultParagraphFont"/>
-    <w:link w:val="Heading3"/>
+  <w:style w:type="character" w:customStyle="1" w:styleId="Kop3Char">
+    <w:name w:val="Kop 3 Char"/>
+    <w:basedOn w:val="Standaardalinea-lettertype"/>
+    <w:link w:val="Kop3"/>
     <w:uiPriority w:val="9"/>
     <w:rsid w:val="00793935"/>
     <w:rPr>
@@ -16715,10 +17516,10 @@
       <w:szCs w:val="28"/>
     </w:rPr>
   </w:style>
-  <w:style w:type="character" w:customStyle="1" w:styleId="Heading4Char">
-    <w:name w:val="Heading 4 Char"/>
-    <w:basedOn w:val="DefaultParagraphFont"/>
-    <w:link w:val="Heading4"/>
+  <w:style w:type="character" w:customStyle="1" w:styleId="Kop4Char">
+    <w:name w:val="Kop 4 Char"/>
+    <w:basedOn w:val="Standaardalinea-lettertype"/>
+    <w:link w:val="Kop4"/>
     <w:uiPriority w:val="9"/>
     <w:semiHidden/>
     <w:rsid w:val="00793935"/>
@@ -16729,10 +17530,10 @@
       <w:color w:val="0F4761" w:themeColor="accent1" w:themeShade="BF"/>
     </w:rPr>
   </w:style>
-  <w:style w:type="character" w:customStyle="1" w:styleId="Heading5Char">
-    <w:name w:val="Heading 5 Char"/>
-    <w:basedOn w:val="DefaultParagraphFont"/>
-    <w:link w:val="Heading5"/>
+  <w:style w:type="character" w:customStyle="1" w:styleId="Kop5Char">
+    <w:name w:val="Kop 5 Char"/>
+    <w:basedOn w:val="Standaardalinea-lettertype"/>
+    <w:link w:val="Kop5"/>
     <w:uiPriority w:val="9"/>
     <w:semiHidden/>
     <w:rsid w:val="00793935"/>
@@ -16741,10 +17542,10 @@
       <w:color w:val="0F4761" w:themeColor="accent1" w:themeShade="BF"/>
     </w:rPr>
   </w:style>
-  <w:style w:type="character" w:customStyle="1" w:styleId="Heading6Char">
-    <w:name w:val="Heading 6 Char"/>
-    <w:basedOn w:val="DefaultParagraphFont"/>
-    <w:link w:val="Heading6"/>
+  <w:style w:type="character" w:customStyle="1" w:styleId="Kop6Char">
+    <w:name w:val="Kop 6 Char"/>
+    <w:basedOn w:val="Standaardalinea-lettertype"/>
+    <w:link w:val="Kop6"/>
     <w:uiPriority w:val="9"/>
     <w:semiHidden/>
     <w:rsid w:val="00793935"/>
@@ -16755,10 +17556,10 @@
       <w:color w:val="595959" w:themeColor="text1" w:themeTint="A6"/>
     </w:rPr>
   </w:style>
-  <w:style w:type="character" w:customStyle="1" w:styleId="Heading7Char">
-    <w:name w:val="Heading 7 Char"/>
-    <w:basedOn w:val="DefaultParagraphFont"/>
-    <w:link w:val="Heading7"/>
+  <w:style w:type="character" w:customStyle="1" w:styleId="Kop7Char">
+    <w:name w:val="Kop 7 Char"/>
+    <w:basedOn w:val="Standaardalinea-lettertype"/>
+    <w:link w:val="Kop7"/>
     <w:uiPriority w:val="9"/>
     <w:semiHidden/>
     <w:rsid w:val="00793935"/>
@@ -16767,10 +17568,10 @@
       <w:color w:val="595959" w:themeColor="text1" w:themeTint="A6"/>
     </w:rPr>
   </w:style>
-  <w:style w:type="character" w:customStyle="1" w:styleId="Heading8Char">
-    <w:name w:val="Heading 8 Char"/>
-    <w:basedOn w:val="DefaultParagraphFont"/>
-    <w:link w:val="Heading8"/>
+  <w:style w:type="character" w:customStyle="1" w:styleId="Kop8Char">
+    <w:name w:val="Kop 8 Char"/>
+    <w:basedOn w:val="Standaardalinea-lettertype"/>
+    <w:link w:val="Kop8"/>
     <w:uiPriority w:val="9"/>
     <w:semiHidden/>
     <w:rsid w:val="00793935"/>
@@ -16781,10 +17582,10 @@
       <w:color w:val="272727" w:themeColor="text1" w:themeTint="D8"/>
     </w:rPr>
   </w:style>
-  <w:style w:type="character" w:customStyle="1" w:styleId="Heading9Char">
-    <w:name w:val="Heading 9 Char"/>
-    <w:basedOn w:val="DefaultParagraphFont"/>
-    <w:link w:val="Heading9"/>
+  <w:style w:type="character" w:customStyle="1" w:styleId="Kop9Char">
+    <w:name w:val="Kop 9 Char"/>
+    <w:basedOn w:val="Standaardalinea-lettertype"/>
+    <w:link w:val="Kop9"/>
     <w:uiPriority w:val="9"/>
     <w:semiHidden/>
     <w:rsid w:val="00793935"/>
@@ -16793,11 +17594,11 @@
       <w:color w:val="272727" w:themeColor="text1" w:themeTint="D8"/>
     </w:rPr>
   </w:style>
-  <w:style w:type="paragraph" w:styleId="Title">
+  <w:style w:type="paragraph" w:styleId="Titel">
     <w:name w:val="Title"/>
-    <w:basedOn w:val="Normal"/>
-    <w:next w:val="Normal"/>
-    <w:link w:val="TitleChar"/>
+    <w:basedOn w:val="Standaard"/>
+    <w:next w:val="Standaard"/>
+    <w:link w:val="TitelChar"/>
     <w:uiPriority w:val="10"/>
     <w:qFormat/>
     <w:rsid w:val="00793935"/>
@@ -16813,10 +17614,10 @@
       <w:szCs w:val="56"/>
     </w:rPr>
   </w:style>
-  <w:style w:type="character" w:customStyle="1" w:styleId="TitleChar">
-    <w:name w:val="Title Char"/>
-    <w:basedOn w:val="DefaultParagraphFont"/>
-    <w:link w:val="Title"/>
+  <w:style w:type="character" w:customStyle="1" w:styleId="TitelChar">
+    <w:name w:val="Titel Char"/>
+    <w:basedOn w:val="Standaardalinea-lettertype"/>
+    <w:link w:val="Titel"/>
     <w:uiPriority w:val="10"/>
     <w:rsid w:val="00793935"/>
     <w:rPr>
@@ -16827,11 +17628,11 @@
       <w:szCs w:val="56"/>
     </w:rPr>
   </w:style>
-  <w:style w:type="paragraph" w:styleId="Subtitle">
+  <w:style w:type="paragraph" w:styleId="Ondertitel">
     <w:name w:val="Subtitle"/>
-    <w:basedOn w:val="Normal"/>
-    <w:next w:val="Normal"/>
-    <w:link w:val="SubtitleChar"/>
+    <w:basedOn w:val="Standaard"/>
+    <w:next w:val="Standaard"/>
+    <w:link w:val="OndertitelChar"/>
     <w:uiPriority w:val="11"/>
     <w:qFormat/>
     <w:rsid w:val="00793935"/>
@@ -16848,10 +17649,10 @@
       <w:szCs w:val="28"/>
     </w:rPr>
   </w:style>
-  <w:style w:type="character" w:customStyle="1" w:styleId="SubtitleChar">
-    <w:name w:val="Subtitle Char"/>
-    <w:basedOn w:val="DefaultParagraphFont"/>
-    <w:link w:val="Subtitle"/>
+  <w:style w:type="character" w:customStyle="1" w:styleId="OndertitelChar">
+    <w:name w:val="Ondertitel Char"/>
+    <w:basedOn w:val="Standaardalinea-lettertype"/>
+    <w:link w:val="Ondertitel"/>
     <w:uiPriority w:val="11"/>
     <w:rsid w:val="00793935"/>
     <w:rPr>
@@ -16862,11 +17663,11 @@
       <w:szCs w:val="28"/>
     </w:rPr>
   </w:style>
-  <w:style w:type="paragraph" w:styleId="Quote">
+  <w:style w:type="paragraph" w:styleId="Citaat">
     <w:name w:val="Quote"/>
-    <w:basedOn w:val="Normal"/>
-    <w:next w:val="Normal"/>
-    <w:link w:val="QuoteChar"/>
+    <w:basedOn w:val="Standaard"/>
+    <w:next w:val="Standaard"/>
+    <w:link w:val="CitaatChar"/>
     <w:uiPriority w:val="29"/>
     <w:qFormat/>
     <w:rsid w:val="00793935"/>
@@ -16880,10 +17681,10 @@
       <w:color w:val="404040" w:themeColor="text1" w:themeTint="BF"/>
     </w:rPr>
   </w:style>
-  <w:style w:type="character" w:customStyle="1" w:styleId="QuoteChar">
-    <w:name w:val="Quote Char"/>
-    <w:basedOn w:val="DefaultParagraphFont"/>
-    <w:link w:val="Quote"/>
+  <w:style w:type="character" w:customStyle="1" w:styleId="CitaatChar">
+    <w:name w:val="Citaat Char"/>
+    <w:basedOn w:val="Standaardalinea-lettertype"/>
+    <w:link w:val="Citaat"/>
     <w:uiPriority w:val="29"/>
     <w:rsid w:val="00793935"/>
     <w:rPr>
@@ -16892,9 +17693,9 @@
       <w:color w:val="404040" w:themeColor="text1" w:themeTint="BF"/>
     </w:rPr>
   </w:style>
-  <w:style w:type="paragraph" w:styleId="ListParagraph">
+  <w:style w:type="paragraph" w:styleId="Lijstalinea">
     <w:name w:val="List Paragraph"/>
-    <w:basedOn w:val="Normal"/>
+    <w:basedOn w:val="Standaard"/>
     <w:uiPriority w:val="34"/>
     <w:qFormat/>
     <w:rsid w:val="00793935"/>
@@ -16903,9 +17704,9 @@
       <w:contextualSpacing/>
     </w:pPr>
   </w:style>
-  <w:style w:type="character" w:styleId="IntenseEmphasis">
+  <w:style w:type="character" w:styleId="Intensievebenadrukking">
     <w:name w:val="Intense Emphasis"/>
-    <w:basedOn w:val="DefaultParagraphFont"/>
+    <w:basedOn w:val="Standaardalinea-lettertype"/>
     <w:uiPriority w:val="21"/>
     <w:qFormat/>
     <w:rsid w:val="00793935"/>
@@ -16915,11 +17716,11 @@
       <w:color w:val="0F4761" w:themeColor="accent1" w:themeShade="BF"/>
     </w:rPr>
   </w:style>
-  <w:style w:type="paragraph" w:styleId="IntenseQuote">
+  <w:style w:type="paragraph" w:styleId="Duidelijkcitaat">
     <w:name w:val="Intense Quote"/>
-    <w:basedOn w:val="Normal"/>
-    <w:next w:val="Normal"/>
-    <w:link w:val="IntenseQuoteChar"/>
+    <w:basedOn w:val="Standaard"/>
+    <w:next w:val="Standaard"/>
+    <w:link w:val="DuidelijkcitaatChar"/>
     <w:uiPriority w:val="30"/>
     <w:qFormat/>
     <w:rsid w:val="00793935"/>
@@ -16938,10 +17739,10 @@
       <w:color w:val="0F4761" w:themeColor="accent1" w:themeShade="BF"/>
     </w:rPr>
   </w:style>
-  <w:style w:type="character" w:customStyle="1" w:styleId="IntenseQuoteChar">
-    <w:name w:val="Intense Quote Char"/>
-    <w:basedOn w:val="DefaultParagraphFont"/>
-    <w:link w:val="IntenseQuote"/>
+  <w:style w:type="character" w:customStyle="1" w:styleId="DuidelijkcitaatChar">
+    <w:name w:val="Duidelijk citaat Char"/>
+    <w:basedOn w:val="Standaardalinea-lettertype"/>
+    <w:link w:val="Duidelijkcitaat"/>
     <w:uiPriority w:val="30"/>
     <w:rsid w:val="00793935"/>
     <w:rPr>
@@ -16950,9 +17751,9 @@
       <w:color w:val="0F4761" w:themeColor="accent1" w:themeShade="BF"/>
     </w:rPr>
   </w:style>
-  <w:style w:type="character" w:styleId="IntenseReference">
+  <w:style w:type="character" w:styleId="Intensieveverwijzing">
     <w:name w:val="Intense Reference"/>
-    <w:basedOn w:val="DefaultParagraphFont"/>
+    <w:basedOn w:val="Standaardalinea-lettertype"/>
     <w:uiPriority w:val="32"/>
     <w:qFormat/>
     <w:rsid w:val="00793935"/>
@@ -16964,10 +17765,10 @@
       <w:spacing w:val="5"/>
     </w:rPr>
   </w:style>
-  <w:style w:type="paragraph" w:styleId="TOCHeading">
+  <w:style w:type="paragraph" w:styleId="Kopvaninhoudsopgave">
     <w:name w:val="TOC Heading"/>
-    <w:basedOn w:val="Heading1"/>
-    <w:next w:val="Normal"/>
+    <w:basedOn w:val="Kop1"/>
+    <w:next w:val="Standaard"/>
     <w:uiPriority w:val="39"/>
     <w:unhideWhenUsed/>
     <w:qFormat/>
@@ -16984,10 +17785,10 @@
       <w14:ligatures w14:val="none"/>
     </w:rPr>
   </w:style>
-  <w:style w:type="paragraph" w:styleId="TOC2">
+  <w:style w:type="paragraph" w:styleId="Inhopg2">
     <w:name w:val="toc 2"/>
-    <w:basedOn w:val="Normal"/>
-    <w:next w:val="Normal"/>
+    <w:basedOn w:val="Standaard"/>
+    <w:next w:val="Standaard"/>
     <w:autoRedefine/>
     <w:uiPriority w:val="39"/>
     <w:unhideWhenUsed/>
@@ -16999,7 +17800,7 @@
   </w:style>
   <w:style w:type="character" w:styleId="Hyperlink">
     <w:name w:val="Hyperlink"/>
-    <w:basedOn w:val="DefaultParagraphFont"/>
+    <w:basedOn w:val="Standaardalinea-lettertype"/>
     <w:uiPriority w:val="99"/>
     <w:unhideWhenUsed/>
     <w:rsid w:val="00714F27"/>
@@ -17008,10 +17809,10 @@
       <w:u w:val="single"/>
     </w:rPr>
   </w:style>
-  <w:style w:type="paragraph" w:styleId="TOC1">
+  <w:style w:type="paragraph" w:styleId="Inhopg1">
     <w:name w:val="toc 1"/>
-    <w:basedOn w:val="Normal"/>
-    <w:next w:val="Normal"/>
+    <w:basedOn w:val="Standaard"/>
+    <w:next w:val="Standaard"/>
     <w:autoRedefine/>
     <w:uiPriority w:val="39"/>
     <w:unhideWhenUsed/>
@@ -17020,9 +17821,9 @@
       <w:spacing w:after="100"/>
     </w:pPr>
   </w:style>
-  <w:style w:type="character" w:styleId="Strong">
+  <w:style w:type="character" w:styleId="Zwaar">
     <w:name w:val="Strong"/>
-    <w:basedOn w:val="DefaultParagraphFont"/>
+    <w:basedOn w:val="Standaardalinea-lettertype"/>
     <w:uiPriority w:val="22"/>
     <w:qFormat/>
     <w:rsid w:val="00926797"/>
@@ -17033,7 +17834,7 @@
   </w:style>
   <w:style w:type="character" w:styleId="HTMLCode">
     <w:name w:val="HTML Code"/>
-    <w:basedOn w:val="DefaultParagraphFont"/>
+    <w:basedOn w:val="Standaardalinea-lettertype"/>
     <w:uiPriority w:val="99"/>
     <w:semiHidden/>
     <w:unhideWhenUsed/>
@@ -17044,9 +17845,9 @@
       <w:szCs w:val="20"/>
     </w:rPr>
   </w:style>
-  <w:style w:type="paragraph" w:styleId="NormalWeb">
+  <w:style w:type="paragraph" w:styleId="Normaalweb">
     <w:name w:val="Normal (Web)"/>
-    <w:basedOn w:val="Normal"/>
+    <w:basedOn w:val="Standaard"/>
     <w:uiPriority w:val="99"/>
     <w:semiHidden/>
     <w:unhideWhenUsed/>
@@ -17063,22 +17864,22 @@
   </w:style>
   <w:style w:type="character" w:customStyle="1" w:styleId="citation-136">
     <w:name w:val="citation-136"/>
-    <w:basedOn w:val="DefaultParagraphFont"/>
+    <w:basedOn w:val="Standaardalinea-lettertype"/>
     <w:rsid w:val="00ED307B"/>
   </w:style>
   <w:style w:type="character" w:customStyle="1" w:styleId="citation-135">
     <w:name w:val="citation-135"/>
-    <w:basedOn w:val="DefaultParagraphFont"/>
+    <w:basedOn w:val="Standaardalinea-lettertype"/>
     <w:rsid w:val="00ED307B"/>
   </w:style>
   <w:style w:type="character" w:customStyle="1" w:styleId="citation-134">
     <w:name w:val="citation-134"/>
-    <w:basedOn w:val="DefaultParagraphFont"/>
+    <w:basedOn w:val="Standaardalinea-lettertype"/>
     <w:rsid w:val="00ED307B"/>
   </w:style>
   <w:style w:type="character" w:customStyle="1" w:styleId="citation-133">
     <w:name w:val="citation-133"/>
-    <w:basedOn w:val="DefaultParagraphFont"/>
+    <w:basedOn w:val="Standaardalinea-lettertype"/>
     <w:rsid w:val="00ED307B"/>
   </w:style>
 </w:styles>

</xml_diff>